<commit_message>
Update README and regenerate README.docx for agentic architecture
README.md updated to reflect create_react_agent, 5 tools (including
weather), multi-file D5 structure, and current CEP requirements coverage.
README.docx regenerated with improved formatting: coloured table headers,
inline bold support, better spacing and margins.

Co-Authored-By: Claude Sonnet 4.6 <noreply@anthropic.com>
</commit_message>
<xml_diff>
--- a/README.docx
+++ b/README.docx
@@ -4,13 +4,14 @@
   <w:body>
     <w:p>
       <w:pPr>
+        <w:spacing w:before="400"/>
         <w:jc w:val="center"/>
       </w:pPr>
       <w:r>
         <w:rPr>
           <w:b/>
           <w:color w:val="2E86AB"/>
-          <w:sz w:val="56"/>
+          <w:sz w:val="64"/>
         </w:rPr>
         <w:t>NewsGenie</w:t>
       </w:r>
@@ -25,7 +26,7 @@
           <w:color w:val="A23B72"/>
           <w:sz w:val="32"/>
         </w:rPr>
-        <w:t>AI-Powered Information and News Assistant</w:t>
+        <w:t>Agentic AI News &amp; Information Assistant</w:t>
       </w:r>
     </w:p>
     <w:p>
@@ -36,92 +37,593 @@
         <w:rPr>
           <w:sz w:val="24"/>
         </w:rPr>
+        <w:t>Course End Project — Applied Generative AI Specialisation</w:t>
+      </w:r>
+    </w:p>
+    <w:p/>
+    <w:p/>
+    <w:p>
+      <w:pPr>
+        <w:spacing w:after="40"/>
+      </w:pPr>
+      <w:r>
+        <w:rPr>
+          <w:b/>
+          <w:sz w:val="22"/>
+        </w:rPr>
         <w:t>Course End Project (CEP) — Applied Generative AI Specialisation</w:t>
       </w:r>
     </w:p>
     <w:p/>
     <w:p>
+      <w:pPr>
+        <w:spacing w:before="120"/>
+      </w:pPr>
       <w:r>
-        <w:t>Course End Project (CEP) — Applied Generative AI Specialisation</w:t>
+        <w:rPr>
+          <w:color w:val="CCCCCC"/>
+        </w:rPr>
+        <w:t>─────────────────────────────────────────────────────────────────</w:t>
       </w:r>
     </w:p>
     <w:p/>
     <w:p>
-      <w:r>
-        <w:t>────────────────────────────────────────────────────────────</w:t>
-      </w:r>
-    </w:p>
-    <w:p/>
-    <w:p>
+      <w:pPr>
+        <w:spacing w:before="200" w:after="80"/>
+      </w:pPr>
       <w:r>
         <w:rPr>
           <w:b/>
           <w:color w:val="A23B72"/>
-          <w:sz w:val="32"/>
+          <w:sz w:val="30"/>
         </w:rPr>
         <w:t>Overview</w:t>
       </w:r>
     </w:p>
     <w:p/>
     <w:p>
+      <w:pPr>
+        <w:spacing w:after="40"/>
+      </w:pPr>
       <w:r>
-        <w:t>NewsGenie is a unified agentic AI platform that helps users navigate today's fast-paced digital news landscape by:</w:t>
+        <w:rPr>
+          <w:b w:val="0"/>
+          <w:sz w:val="22"/>
+        </w:rPr>
+        <w:t xml:space="preserve">NewsGenie is a truly </w:t>
+      </w:r>
+      <w:r>
+        <w:rPr>
+          <w:b/>
+          <w:sz w:val="22"/>
+        </w:rPr>
+        <w:t>agentic</w:t>
+      </w:r>
+      <w:r>
+        <w:rPr>
+          <w:b w:val="0"/>
+          <w:sz w:val="22"/>
+        </w:rPr>
+        <w:t xml:space="preserve"> AI news and information assistant built with </w:t>
+      </w:r>
+      <w:r>
+        <w:rPr>
+          <w:b/>
+          <w:sz w:val="22"/>
+        </w:rPr>
+        <w:t>LangGraph create_react_agent</w:t>
+      </w:r>
+      <w:r>
+        <w:rPr>
+          <w:b w:val="0"/>
+          <w:sz w:val="22"/>
+        </w:rPr>
+        <w:t xml:space="preserve">. Unlike a traditional rule-based pipeline, the LLM autonomously decides which tools to invoke and in what order — a classic </w:t>
+      </w:r>
+      <w:r>
+        <w:rPr>
+          <w:b/>
+          <w:sz w:val="22"/>
+        </w:rPr>
+        <w:t>ReAct (Reasoning + Acting)</w:t>
+      </w:r>
+      <w:r>
+        <w:rPr>
+          <w:b w:val="0"/>
+          <w:sz w:val="22"/>
+        </w:rPr>
+        <w:t xml:space="preserve"> loop.</w:t>
+      </w:r>
+    </w:p>
+    <w:p/>
+    <w:p>
+      <w:pPr>
+        <w:spacing w:after="40"/>
+      </w:pPr>
+      <w:r>
+        <w:rPr>
+          <w:b/>
+          <w:sz w:val="22"/>
+        </w:rPr>
+        <w:t>Core capabilities:</w:t>
       </w:r>
     </w:p>
     <w:p/>
     <w:p>
       <w:pPr>
         <w:pStyle w:val="ListBullet"/>
+        <w:spacing w:after="40"/>
       </w:pPr>
       <w:r>
-        <w:t>💬 Handling conversations — interprets general queries and answers via GPT-4o-mini</w:t>
+        <w:rPr>
+          <w:b w:val="0"/>
+          <w:sz w:val="22"/>
+        </w:rPr>
+        <w:t xml:space="preserve">📰 </w:t>
+      </w:r>
+      <w:r>
+        <w:rPr>
+          <w:b/>
+          <w:sz w:val="22"/>
+        </w:rPr>
+        <w:t>Real-time news headlines</w:t>
+      </w:r>
+      <w:r>
+        <w:rPr>
+          <w:b w:val="0"/>
+          <w:sz w:val="22"/>
+        </w:rPr>
+        <w:t xml:space="preserve"> — fetches top stories by category (Technology, Finance, Sports, Health, Science, Entertainment, General)</w:t>
       </w:r>
     </w:p>
     <w:p>
       <w:pPr>
         <w:pStyle w:val="ListBullet"/>
+        <w:spacing w:after="40"/>
       </w:pPr>
       <w:r>
-        <w:t>📰 Fetching real-time news — curates top headlines by category (Technology, Finance, Sports, Health, Science, General)</w:t>
+        <w:rPr>
+          <w:b w:val="0"/>
+          <w:sz w:val="22"/>
+        </w:rPr>
+        <w:t xml:space="preserve">🔍 </w:t>
+      </w:r>
+      <w:r>
+        <w:rPr>
+          <w:b/>
+          <w:sz w:val="22"/>
+        </w:rPr>
+        <w:t>Topic news search</w:t>
+      </w:r>
+      <w:r>
+        <w:rPr>
+          <w:b w:val="0"/>
+          <w:sz w:val="22"/>
+        </w:rPr>
+        <w:t xml:space="preserve"> — finds recent articles on any specific subject or event</w:t>
       </w:r>
     </w:p>
     <w:p>
       <w:pPr>
         <w:pStyle w:val="ListBullet"/>
+        <w:spacing w:after="40"/>
       </w:pPr>
       <w:r>
-        <w:t>🔍 Performing web searches — enriches responses with live external information via DuckDuckGo</w:t>
+        <w:rPr>
+          <w:b w:val="0"/>
+          <w:sz w:val="22"/>
+        </w:rPr>
+        <w:t xml:space="preserve">🌐 </w:t>
+      </w:r>
+      <w:r>
+        <w:rPr>
+          <w:b/>
+          <w:sz w:val="22"/>
+        </w:rPr>
+        <w:t>Live web search</w:t>
+      </w:r>
+      <w:r>
+        <w:rPr>
+          <w:b w:val="0"/>
+          <w:sz w:val="22"/>
+        </w:rPr>
+        <w:t xml:space="preserve"> — retrieves real-time facts, prices, and current information</w:t>
       </w:r>
     </w:p>
     <w:p>
       <w:pPr>
         <w:pStyle w:val="ListBullet"/>
+        <w:spacing w:after="40"/>
       </w:pPr>
       <w:r>
-        <w:t>🔀 Routing intelligently — LangGraph StateGraph classifies every query and dispatches to the right handler</w:t>
+        <w:rPr>
+          <w:b w:val="0"/>
+          <w:sz w:val="22"/>
+        </w:rPr>
+        <w:t xml:space="preserve">🌤️ </w:t>
+      </w:r>
+      <w:r>
+        <w:rPr>
+          <w:b/>
+          <w:sz w:val="22"/>
+        </w:rPr>
+        <w:t>Weather forecasts</w:t>
+      </w:r>
+      <w:r>
+        <w:rPr>
+          <w:b w:val="0"/>
+          <w:sz w:val="22"/>
+        </w:rPr>
+        <w:t xml:space="preserve"> — current conditions and 3-day forecasts for any city worldwide</w:t>
       </w:r>
     </w:p>
     <w:p>
       <w:pPr>
         <w:pStyle w:val="ListBullet"/>
+        <w:spacing w:after="40"/>
       </w:pPr>
       <w:r>
-        <w:t>🛡️ Handling failures gracefully — automatic fallback from NewsAPI → DuckDuckGo → LLM</w:t>
+        <w:rPr>
+          <w:b w:val="0"/>
+          <w:sz w:val="22"/>
+        </w:rPr>
+        <w:t xml:space="preserve">💬 </w:t>
+      </w:r>
+      <w:r>
+        <w:rPr>
+          <w:b/>
+          <w:sz w:val="22"/>
+        </w:rPr>
+        <w:t>Conversational AI</w:t>
+      </w:r>
+      <w:r>
+        <w:rPr>
+          <w:b w:val="0"/>
+          <w:sz w:val="22"/>
+        </w:rPr>
+        <w:t xml:space="preserve"> — answers general knowledge questions directly from LLM training</w:t>
+      </w:r>
+    </w:p>
+    <w:p>
+      <w:pPr>
+        <w:pStyle w:val="ListBullet"/>
+        <w:spacing w:after="40"/>
+      </w:pPr>
+      <w:r>
+        <w:rPr>
+          <w:b w:val="0"/>
+          <w:sz w:val="22"/>
+        </w:rPr>
+        <w:t xml:space="preserve">🧠 </w:t>
+      </w:r>
+      <w:r>
+        <w:rPr>
+          <w:b/>
+          <w:sz w:val="22"/>
+        </w:rPr>
+        <w:t>Multi-turn memory</w:t>
+      </w:r>
+      <w:r>
+        <w:rPr>
+          <w:b w:val="0"/>
+          <w:sz w:val="22"/>
+        </w:rPr>
+        <w:t xml:space="preserve"> — remembers context across the full conversation via `MemorySaver`</w:t>
       </w:r>
     </w:p>
     <w:p/>
     <w:p>
+      <w:pPr>
+        <w:spacing w:before="120"/>
+      </w:pPr>
       <w:r>
-        <w:t>────────────────────────────────────────────────────────────</w:t>
+        <w:rPr>
+          <w:color w:val="CCCCCC"/>
+        </w:rPr>
+        <w:t>─────────────────────────────────────────────────────────────────</w:t>
       </w:r>
     </w:p>
     <w:p/>
     <w:p>
+      <w:pPr>
+        <w:spacing w:before="200" w:after="80"/>
+      </w:pPr>
       <w:r>
         <w:rPr>
           <w:b/>
           <w:color w:val="A23B72"/>
-          <w:sz w:val="32"/>
+          <w:sz w:val="30"/>
+        </w:rPr>
+        <w:t>Agentic Architecture</w:t>
+      </w:r>
+    </w:p>
+    <w:p/>
+    <w:p>
+      <w:pPr>
+        <w:spacing w:after="0"/>
+        <w:ind w:left="576"/>
+      </w:pPr>
+      <w:r>
+        <w:rPr>
+          <w:rFonts w:ascii="Courier New" w:hAnsi="Courier New"/>
+          <w:color w:val="264653"/>
+          <w:sz w:val="18"/>
+        </w:rPr>
+        <w:t>User Query</w:t>
+      </w:r>
+    </w:p>
+    <w:p>
+      <w:pPr>
+        <w:spacing w:after="0"/>
+        <w:ind w:left="576"/>
+      </w:pPr>
+      <w:r>
+        <w:rPr>
+          <w:rFonts w:ascii="Courier New" w:hAnsi="Courier New"/>
+          <w:color w:val="264653"/>
+          <w:sz w:val="18"/>
+        </w:rPr>
+        <w:t xml:space="preserve">    │</w:t>
+      </w:r>
+    </w:p>
+    <w:p>
+      <w:pPr>
+        <w:spacing w:after="0"/>
+        <w:ind w:left="576"/>
+      </w:pPr>
+      <w:r>
+        <w:rPr>
+          <w:rFonts w:ascii="Courier New" w:hAnsi="Courier New"/>
+          <w:color w:val="264653"/>
+          <w:sz w:val="18"/>
+        </w:rPr>
+        <w:t xml:space="preserve">    ▼</w:t>
+      </w:r>
+    </w:p>
+    <w:p>
+      <w:pPr>
+        <w:spacing w:after="0"/>
+        <w:ind w:left="576"/>
+      </w:pPr>
+      <w:r>
+        <w:rPr>
+          <w:rFonts w:ascii="Courier New" w:hAnsi="Courier New"/>
+          <w:color w:val="264653"/>
+          <w:sz w:val="18"/>
+        </w:rPr>
+        <w:t>create_react_agent  (LangGraph ReAct Loop)</w:t>
+      </w:r>
+    </w:p>
+    <w:p>
+      <w:pPr>
+        <w:spacing w:after="0"/>
+        <w:ind w:left="576"/>
+      </w:pPr>
+      <w:r>
+        <w:rPr>
+          <w:rFonts w:ascii="Courier New" w:hAnsi="Courier New"/>
+          <w:color w:val="264653"/>
+          <w:sz w:val="18"/>
+        </w:rPr>
+        <w:t xml:space="preserve">    │</w:t>
+      </w:r>
+    </w:p>
+    <w:p>
+      <w:pPr>
+        <w:spacing w:after="0"/>
+        <w:ind w:left="576"/>
+      </w:pPr>
+      <w:r>
+        <w:rPr>
+          <w:rFonts w:ascii="Courier New" w:hAnsi="Courier New"/>
+          <w:color w:val="264653"/>
+          <w:sz w:val="18"/>
+        </w:rPr>
+        <w:t xml:space="preserve">    ├── LLM Reasoning  ←── decides which tool(s) to call</w:t>
+      </w:r>
+    </w:p>
+    <w:p>
+      <w:pPr>
+        <w:spacing w:after="0"/>
+        <w:ind w:left="576"/>
+      </w:pPr>
+      <w:r>
+        <w:rPr>
+          <w:rFonts w:ascii="Courier New" w:hAnsi="Courier New"/>
+          <w:color w:val="264653"/>
+          <w:sz w:val="18"/>
+        </w:rPr>
+        <w:t xml:space="preserve">    │</w:t>
+      </w:r>
+    </w:p>
+    <w:p>
+      <w:pPr>
+        <w:spacing w:after="0"/>
+        <w:ind w:left="576"/>
+      </w:pPr>
+      <w:r>
+        <w:rPr>
+          <w:rFonts w:ascii="Courier New" w:hAnsi="Courier New"/>
+          <w:color w:val="264653"/>
+          <w:sz w:val="18"/>
+        </w:rPr>
+        <w:t xml:space="preserve">    ├── Tool Execution</w:t>
+      </w:r>
+    </w:p>
+    <w:p>
+      <w:pPr>
+        <w:spacing w:after="0"/>
+        <w:ind w:left="576"/>
+      </w:pPr>
+      <w:r>
+        <w:rPr>
+          <w:rFonts w:ascii="Courier New" w:hAnsi="Courier New"/>
+          <w:color w:val="264653"/>
+          <w:sz w:val="18"/>
+        </w:rPr>
+        <w:t xml:space="preserve">    │       ├── get_top_headlines(category)   ← news by category</w:t>
+      </w:r>
+    </w:p>
+    <w:p>
+      <w:pPr>
+        <w:spacing w:after="0"/>
+        <w:ind w:left="576"/>
+      </w:pPr>
+      <w:r>
+        <w:rPr>
+          <w:rFonts w:ascii="Courier New" w:hAnsi="Courier New"/>
+          <w:color w:val="264653"/>
+          <w:sz w:val="18"/>
+        </w:rPr>
+        <w:t xml:space="preserve">    │       ├── search_news(query)             ← topic news search</w:t>
+      </w:r>
+    </w:p>
+    <w:p>
+      <w:pPr>
+        <w:spacing w:after="0"/>
+        <w:ind w:left="576"/>
+      </w:pPr>
+      <w:r>
+        <w:rPr>
+          <w:rFonts w:ascii="Courier New" w:hAnsi="Courier New"/>
+          <w:color w:val="264653"/>
+          <w:sz w:val="18"/>
+        </w:rPr>
+        <w:t xml:space="preserve">    │       ├── search_web(query)              ← live web facts</w:t>
+      </w:r>
+    </w:p>
+    <w:p>
+      <w:pPr>
+        <w:spacing w:after="0"/>
+        <w:ind w:left="576"/>
+      </w:pPr>
+      <w:r>
+        <w:rPr>
+          <w:rFonts w:ascii="Courier New" w:hAnsi="Courier New"/>
+          <w:color w:val="264653"/>
+          <w:sz w:val="18"/>
+        </w:rPr>
+        <w:t xml:space="preserve">    │       ├── get_weather(location)          ← weather forecast</w:t>
+      </w:r>
+    </w:p>
+    <w:p>
+      <w:pPr>
+        <w:spacing w:after="0"/>
+        <w:ind w:left="576"/>
+      </w:pPr>
+      <w:r>
+        <w:rPr>
+          <w:rFonts w:ascii="Courier New" w:hAnsi="Courier New"/>
+          <w:color w:val="264653"/>
+          <w:sz w:val="18"/>
+        </w:rPr>
+        <w:t xml:space="preserve">    │       └── get_news_categories()          ← list categories</w:t>
+      </w:r>
+    </w:p>
+    <w:p>
+      <w:pPr>
+        <w:spacing w:after="0"/>
+        <w:ind w:left="576"/>
+      </w:pPr>
+      <w:r>
+        <w:rPr>
+          <w:rFonts w:ascii="Courier New" w:hAnsi="Courier New"/>
+          <w:color w:val="264653"/>
+          <w:sz w:val="18"/>
+        </w:rPr>
+        <w:t xml:space="preserve">    │</w:t>
+      </w:r>
+    </w:p>
+    <w:p>
+      <w:pPr>
+        <w:spacing w:after="0"/>
+        <w:ind w:left="576"/>
+      </w:pPr>
+      <w:r>
+        <w:rPr>
+          <w:rFonts w:ascii="Courier New" w:hAnsi="Courier New"/>
+          <w:color w:val="264653"/>
+          <w:sz w:val="18"/>
+        </w:rPr>
+        <w:t xml:space="preserve">    ├── Tool Results  ──► LLM Synthesises Final Answer</w:t>
+      </w:r>
+    </w:p>
+    <w:p>
+      <w:pPr>
+        <w:spacing w:after="0"/>
+        <w:ind w:left="576"/>
+      </w:pPr>
+      <w:r>
+        <w:rPr>
+          <w:rFonts w:ascii="Courier New" w:hAnsi="Courier New"/>
+          <w:color w:val="264653"/>
+          <w:sz w:val="18"/>
+        </w:rPr>
+        <w:t xml:space="preserve">    │</w:t>
+      </w:r>
+    </w:p>
+    <w:p>
+      <w:pPr>
+        <w:spacing w:after="0"/>
+        <w:ind w:left="576"/>
+      </w:pPr>
+      <w:r>
+        <w:rPr>
+          <w:rFonts w:ascii="Courier New" w:hAnsi="Courier New"/>
+          <w:color w:val="264653"/>
+          <w:sz w:val="18"/>
+        </w:rPr>
+        <w:t xml:space="preserve">    └── MemorySaver  ←── persists conversation across turns</w:t>
+      </w:r>
+    </w:p>
+    <w:p/>
+    <w:p/>
+    <w:p>
+      <w:pPr>
+        <w:spacing w:after="40"/>
+      </w:pPr>
+      <w:r>
+        <w:rPr>
+          <w:b/>
+          <w:sz w:val="22"/>
+        </w:rPr>
+        <w:t>What makes it agentic:</w:t>
+      </w:r>
+    </w:p>
+    <w:p>
+      <w:pPr>
+        <w:spacing w:after="40"/>
+      </w:pPr>
+      <w:r>
+        <w:rPr>
+          <w:b w:val="0"/>
+          <w:sz w:val="22"/>
+        </w:rPr>
+        <w:t>The LLM reads each tool's docstring and autonomously decides which tool(s) to call, what arguments to pass, and how to synthesise results — with no hard-coded routing logic.</w:t>
+      </w:r>
+    </w:p>
+    <w:p/>
+    <w:p>
+      <w:pPr>
+        <w:spacing w:before="120"/>
+      </w:pPr>
+      <w:r>
+        <w:rPr>
+          <w:color w:val="CCCCCC"/>
+        </w:rPr>
+        <w:t>─────────────────────────────────────────────────────────────────</w:t>
+      </w:r>
+    </w:p>
+    <w:p/>
+    <w:p>
+      <w:pPr>
+        <w:spacing w:before="200" w:after="80"/>
+      </w:pPr>
+      <w:r>
+        <w:rPr>
+          <w:b/>
+          <w:color w:val="A23B72"/>
+          <w:sz w:val="30"/>
         </w:rPr>
         <w:t>Project Structure</w:t>
       </w:r>
@@ -129,6 +631,7 @@
     <w:p/>
     <w:p>
       <w:pPr>
+        <w:spacing w:after="0"/>
         <w:ind w:left="576"/>
       </w:pPr>
       <w:r>
@@ -142,6 +645,7 @@
     </w:p>
     <w:p>
       <w:pPr>
+        <w:spacing w:after="0"/>
         <w:ind w:left="576"/>
       </w:pPr>
       <w:r>
@@ -150,11 +654,12 @@
           <w:color w:val="264653"/>
           <w:sz w:val="18"/>
         </w:rPr>
-        <w:t>├── AgenticsNewsGenie_Capstone.ipynb  # Main notebook — all steps + test cases</w:t>
+        <w:t>├── AgenticsNewsGenie_Capstone.ipynb  # Main notebook — all steps, demos, test cases</w:t>
       </w:r>
     </w:p>
     <w:p>
       <w:pPr>
+        <w:spacing w:after="0"/>
         <w:ind w:left="576"/>
       </w:pPr>
       <w:r>
@@ -163,11 +668,54 @@
           <w:color w:val="264653"/>
           <w:sz w:val="18"/>
         </w:rPr>
-        <w:t>├── streamlit_app.py                  # Interactive Streamlit UI (3 pages)</w:t>
+        <w:t>├── tools.py                          # @tool-decorated agent tools (5 tools)</w:t>
       </w:r>
     </w:p>
     <w:p>
       <w:pPr>
+        <w:spacing w:after="0"/>
+        <w:ind w:left="576"/>
+      </w:pPr>
+      <w:r>
+        <w:rPr>
+          <w:rFonts w:ascii="Courier New" w:hAnsi="Courier New"/>
+          <w:color w:val="264653"/>
+          <w:sz w:val="18"/>
+        </w:rPr>
+        <w:t>├── agents.py                         # create_react_agent setup + system prompt</w:t>
+      </w:r>
+    </w:p>
+    <w:p>
+      <w:pPr>
+        <w:spacing w:after="0"/>
+        <w:ind w:left="576"/>
+      </w:pPr>
+      <w:r>
+        <w:rPr>
+          <w:rFonts w:ascii="Courier New" w:hAnsi="Courier New"/>
+          <w:color w:val="264653"/>
+          <w:sz w:val="18"/>
+        </w:rPr>
+        <w:t>├── workflow.py                       # run_agent() helper + MemorySaver</w:t>
+      </w:r>
+    </w:p>
+    <w:p>
+      <w:pPr>
+        <w:spacing w:after="0"/>
+        <w:ind w:left="576"/>
+      </w:pPr>
+      <w:r>
+        <w:rPr>
+          <w:rFonts w:ascii="Courier New" w:hAnsi="Courier New"/>
+          <w:color w:val="264653"/>
+          <w:sz w:val="18"/>
+        </w:rPr>
+        <w:t>├── streamlit_app.py                  # Streamlit UI — 3 pages</w:t>
+      </w:r>
+    </w:p>
+    <w:p>
+      <w:pPr>
+        <w:spacing w:after="0"/>
         <w:ind w:left="576"/>
       </w:pPr>
       <w:r>
@@ -181,6 +729,7 @@
     </w:p>
     <w:p>
       <w:pPr>
+        <w:spacing w:after="0"/>
         <w:ind w:left="576"/>
       </w:pPr>
       <w:r>
@@ -194,6 +743,7 @@
     </w:p>
     <w:p>
       <w:pPr>
+        <w:spacing w:after="0"/>
         <w:ind w:left="576"/>
       </w:pPr>
       <w:r>
@@ -202,11 +752,12 @@
           <w:color w:val="264653"/>
           <w:sz w:val="18"/>
         </w:rPr>
-        <w:t>├── test_cases.md                     # 30+ detailed test cases</w:t>
+        <w:t>├── test_cases.md                     # 30 detailed test cases</w:t>
       </w:r>
     </w:p>
     <w:p>
       <w:pPr>
+        <w:spacing w:after="0"/>
         <w:ind w:left="576"/>
       </w:pPr>
       <w:r>
@@ -220,6 +771,7 @@
     </w:p>
     <w:p>
       <w:pPr>
+        <w:spacing w:after="0"/>
         <w:ind w:left="576"/>
       </w:pPr>
       <w:r>
@@ -228,23 +780,32 @@
           <w:color w:val="264653"/>
           <w:sz w:val="18"/>
         </w:rPr>
-        <w:t>└── README.docx                       # Word version of README</w:t>
+        <w:t>└── README.docx                       # Word version of this README</w:t>
       </w:r>
     </w:p>
     <w:p/>
     <w:p/>
     <w:p>
+      <w:pPr>
+        <w:spacing w:before="120"/>
+      </w:pPr>
       <w:r>
-        <w:t>────────────────────────────────────────────────────────────</w:t>
+        <w:rPr>
+          <w:color w:val="CCCCCC"/>
+        </w:rPr>
+        <w:t>─────────────────────────────────────────────────────────────────</w:t>
       </w:r>
     </w:p>
     <w:p/>
     <w:p>
+      <w:pPr>
+        <w:spacing w:before="200" w:after="80"/>
+      </w:pPr>
       <w:r>
         <w:rPr>
           <w:b/>
           <w:color w:val="A23B72"/>
-          <w:sz w:val="32"/>
+          <w:sz w:val="30"/>
         </w:rPr>
         <w:t>Prerequisites</w:t>
       </w:r>
@@ -253,57 +814,119 @@
     <w:p>
       <w:pPr>
         <w:pStyle w:val="ListBullet"/>
+        <w:spacing w:after="40"/>
       </w:pPr>
       <w:r>
-        <w:t>Python 3.9+</w:t>
+        <w:rPr>
+          <w:b w:val="0"/>
+          <w:sz w:val="22"/>
+        </w:rPr>
+        <w:t xml:space="preserve">Python </w:t>
+      </w:r>
+      <w:r>
+        <w:rPr>
+          <w:b/>
+          <w:sz w:val="22"/>
+        </w:rPr>
+        <w:t>3.9+</w:t>
       </w:r>
     </w:p>
     <w:p>
       <w:pPr>
         <w:pStyle w:val="ListBullet"/>
+        <w:spacing w:after="40"/>
       </w:pPr>
       <w:r>
-        <w:t>OpenAI API key (required)</w:t>
+        <w:rPr>
+          <w:b/>
+          <w:sz w:val="22"/>
+        </w:rPr>
+        <w:t>OpenAI API key</w:t>
+      </w:r>
+      <w:r>
+        <w:rPr>
+          <w:b w:val="0"/>
+          <w:sz w:val="22"/>
+        </w:rPr>
+        <w:t xml:space="preserve"> (required) — used for the ReAct agent LLM</w:t>
       </w:r>
     </w:p>
     <w:p>
       <w:pPr>
         <w:pStyle w:val="ListBullet"/>
+        <w:spacing w:after="40"/>
       </w:pPr>
       <w:r>
-        <w:t>NewsAPI key (optional — free tier at [newsapi.org](https://newsapi.org). DuckDuckGo is used automatically if not set)</w:t>
+        <w:rPr>
+          <w:b/>
+          <w:sz w:val="22"/>
+        </w:rPr>
+        <w:t>NewsAPI key</w:t>
+      </w:r>
+      <w:r>
+        <w:rPr>
+          <w:b w:val="0"/>
+          <w:sz w:val="22"/>
+        </w:rPr>
+        <w:t xml:space="preserve"> (optional — free tier at newsapi.org; DuckDuckGo used automatically if not set)</w:t>
+      </w:r>
+    </w:p>
+    <w:p>
+      <w:pPr>
+        <w:pStyle w:val="ListBullet"/>
+        <w:spacing w:after="40"/>
+      </w:pPr>
+      <w:r>
+        <w:rPr>
+          <w:b w:val="0"/>
+          <w:sz w:val="22"/>
+        </w:rPr>
+        <w:t>No key required for weather (Open-Meteo) or web search (DuckDuckGo)</w:t>
       </w:r>
     </w:p>
     <w:p/>
     <w:p>
+      <w:pPr>
+        <w:spacing w:before="120"/>
+      </w:pPr>
       <w:r>
-        <w:t>────────────────────────────────────────────────────────────</w:t>
+        <w:rPr>
+          <w:color w:val="CCCCCC"/>
+        </w:rPr>
+        <w:t>─────────────────────────────────────────────────────────────────</w:t>
       </w:r>
     </w:p>
     <w:p/>
     <w:p>
+      <w:pPr>
+        <w:spacing w:before="200" w:after="80"/>
+      </w:pPr>
       <w:r>
         <w:rPr>
           <w:b/>
           <w:color w:val="A23B72"/>
-          <w:sz w:val="32"/>
+          <w:sz w:val="30"/>
         </w:rPr>
         <w:t>Setup Instructions</w:t>
       </w:r>
     </w:p>
     <w:p/>
     <w:p>
+      <w:pPr>
+        <w:spacing w:before="120" w:after="80"/>
+      </w:pPr>
       <w:r>
         <w:rPr>
           <w:b/>
           <w:color w:val="264653"/>
-          <w:sz w:val="26"/>
+          <w:sz w:val="24"/>
         </w:rPr>
         <w:t>Step 1 — Install dependencies</w:t>
       </w:r>
     </w:p>
     <w:p>
       <w:pPr>
+        <w:spacing w:after="0"/>
         <w:ind w:left="576"/>
       </w:pPr>
       <w:r>
@@ -318,23 +941,34 @@
     <w:p/>
     <w:p/>
     <w:p>
+      <w:pPr>
+        <w:spacing w:before="120" w:after="80"/>
+      </w:pPr>
       <w:r>
         <w:rPr>
           <w:b/>
           <w:color w:val="264653"/>
-          <w:sz w:val="26"/>
+          <w:sz w:val="24"/>
         </w:rPr>
         <w:t>Step 2 — Configure API keys</w:t>
       </w:r>
     </w:p>
     <w:p/>
     <w:p>
+      <w:pPr>
+        <w:spacing w:after="40"/>
+      </w:pPr>
       <w:r>
+        <w:rPr>
+          <w:b w:val="0"/>
+          <w:sz w:val="22"/>
+        </w:rPr>
         <w:t>Edit .env:</w:t>
       </w:r>
     </w:p>
     <w:p>
       <w:pPr>
+        <w:spacing w:after="0"/>
         <w:ind w:left="576"/>
       </w:pPr>
       <w:r>
@@ -348,6 +982,7 @@
     </w:p>
     <w:p>
       <w:pPr>
+        <w:spacing w:after="0"/>
         <w:ind w:left="576"/>
       </w:pPr>
       <w:r>
@@ -362,34 +997,47 @@
     <w:p/>
     <w:p/>
     <w:p>
+      <w:pPr>
+        <w:spacing w:before="120"/>
+      </w:pPr>
       <w:r>
-        <w:t>────────────────────────────────────────────────────────────</w:t>
+        <w:rPr>
+          <w:color w:val="CCCCCC"/>
+        </w:rPr>
+        <w:t>─────────────────────────────────────────────────────────────────</w:t>
       </w:r>
     </w:p>
     <w:p/>
     <w:p>
+      <w:pPr>
+        <w:spacing w:before="200" w:after="80"/>
+      </w:pPr>
       <w:r>
         <w:rPr>
           <w:b/>
           <w:color w:val="A23B72"/>
-          <w:sz w:val="32"/>
+          <w:sz w:val="30"/>
         </w:rPr>
         <w:t>Running the Project</w:t>
       </w:r>
     </w:p>
     <w:p/>
     <w:p>
+      <w:pPr>
+        <w:spacing w:before="120" w:after="80"/>
+      </w:pPr>
       <w:r>
         <w:rPr>
           <w:b/>
           <w:color w:val="264653"/>
-          <w:sz w:val="26"/>
+          <w:sz w:val="24"/>
         </w:rPr>
         <w:t>Option A — Jupyter Notebook (recommended for grading)</w:t>
       </w:r>
     </w:p>
     <w:p>
       <w:pPr>
+        <w:spacing w:after="0"/>
         <w:ind w:left="576"/>
       </w:pPr>
       <w:r>
@@ -403,7 +1051,14 @@
     </w:p>
     <w:p/>
     <w:p>
+      <w:pPr>
+        <w:spacing w:after="40"/>
+      </w:pPr>
       <w:r>
+        <w:rPr>
+          <w:b w:val="0"/>
+          <w:sz w:val="22"/>
+        </w:rPr>
         <w:t>Run cells top to bottom.</w:t>
       </w:r>
     </w:p>
@@ -415,18 +1070,27 @@
         <w:tblLook w:firstColumn="1" w:firstRow="1" w:lastColumn="0" w:lastRow="0" w:noHBand="0" w:noVBand="1" w:val="04A0"/>
       </w:tblPr>
       <w:tblGrid>
-        <w:gridCol w:w="4320"/>
-        <w:gridCol w:w="4320"/>
+        <w:gridCol w:w="4392"/>
+        <w:gridCol w:w="4392"/>
       </w:tblGrid>
       <w:tr>
         <w:tc>
           <w:tcPr>
-            <w:tcW w:type="dxa" w:w="4320"/>
+            <w:tcW w:type="dxa" w:w="4392"/>
+            <w:shd w:val="clear" w:color="auto" w:fill="2E86AB"/>
           </w:tcPr>
           <w:p>
             <w:r>
               <w:rPr>
                 <w:b/>
+                <w:color w:val="FFFFFF"/>
+              </w:rPr>
+            </w:r>
+            <w:r>
+              <w:rPr>
+                <w:b/>
+                <w:color w:val="FFFFFF"/>
+                <w:sz w:val="22"/>
               </w:rPr>
               <w:t>Step</w:t>
             </w:r>
@@ -434,12 +1098,21 @@
         </w:tc>
         <w:tc>
           <w:tcPr>
-            <w:tcW w:type="dxa" w:w="4320"/>
+            <w:tcW w:type="dxa" w:w="4392"/>
+            <w:shd w:val="clear" w:color="auto" w:fill="2E86AB"/>
           </w:tcPr>
           <w:p>
             <w:r>
               <w:rPr>
                 <w:b/>
+                <w:color w:val="FFFFFF"/>
+              </w:rPr>
+            </w:r>
+            <w:r>
+              <w:rPr>
+                <w:b/>
+                <w:color w:val="FFFFFF"/>
+                <w:sz w:val="22"/>
               </w:rPr>
               <w:t>Description</w:t>
             </w:r>
@@ -449,21 +1122,31 @@
       <w:tr>
         <w:tc>
           <w:tcPr>
-            <w:tcW w:type="dxa" w:w="4320"/>
+            <w:tcW w:type="dxa" w:w="4392"/>
           </w:tcPr>
           <w:p>
+            <w:r/>
             <w:r>
+              <w:rPr>
+                <w:b w:val="0"/>
+                <w:sz w:val="22"/>
+              </w:rPr>
               <w:t>Setup</w:t>
             </w:r>
           </w:p>
         </w:tc>
         <w:tc>
           <w:tcPr>
-            <w:tcW w:type="dxa" w:w="4320"/>
+            <w:tcW w:type="dxa" w:w="4392"/>
           </w:tcPr>
           <w:p>
+            <w:r/>
             <w:r>
-              <w:t>Load `.env`, import all libraries</w:t>
+              <w:rPr>
+                <w:b w:val="0"/>
+                <w:sz w:val="22"/>
+              </w:rPr>
+              <w:t>Load `.env`, install imports</w:t>
             </w:r>
           </w:p>
         </w:tc>
@@ -471,21 +1154,31 @@
       <w:tr>
         <w:tc>
           <w:tcPr>
-            <w:tcW w:type="dxa" w:w="4320"/>
+            <w:tcW w:type="dxa" w:w="4392"/>
           </w:tcPr>
           <w:p>
+            <w:r/>
             <w:r>
+              <w:rPr>
+                <w:b w:val="0"/>
+                <w:sz w:val="22"/>
+              </w:rPr>
               <w:t>Step 1</w:t>
             </w:r>
           </w:p>
         </w:tc>
         <w:tc>
           <w:tcPr>
-            <w:tcW w:type="dxa" w:w="4320"/>
+            <w:tcW w:type="dxa" w:w="4392"/>
           </w:tcPr>
           <w:p>
+            <w:r/>
             <w:r>
-              <w:t>Define `NewsGenieState` + Router node (LLM-powered query classification)</w:t>
+              <w:rPr>
+                <w:b w:val="0"/>
+                <w:sz w:val="22"/>
+              </w:rPr>
+              <w:t>Environment setup and library imports</w:t>
             </w:r>
           </w:p>
         </w:tc>
@@ -493,21 +1186,31 @@
       <w:tr>
         <w:tc>
           <w:tcPr>
-            <w:tcW w:type="dxa" w:w="4320"/>
+            <w:tcW w:type="dxa" w:w="4392"/>
           </w:tcPr>
           <w:p>
+            <w:r/>
             <w:r>
+              <w:rPr>
+                <w:b w:val="0"/>
+                <w:sz w:val="22"/>
+              </w:rPr>
               <w:t>Step 2</w:t>
             </w:r>
           </w:p>
         </w:tc>
         <w:tc>
           <w:tcPr>
-            <w:tcW w:type="dxa" w:w="4320"/>
+            <w:tcW w:type="dxa" w:w="4392"/>
           </w:tcPr>
           <w:p>
+            <w:r/>
             <w:r>
-              <w:t>News Fetching node — NewsAPI (primary) + DuckDuckGo (fallback)</w:t>
+              <w:rPr>
+                <w:b w:val="0"/>
+                <w:sz w:val="22"/>
+              </w:rPr>
+              <w:t>Define 5 `@tool`-decorated agent tools</w:t>
             </w:r>
           </w:p>
         </w:tc>
@@ -515,21 +1218,31 @@
       <w:tr>
         <w:tc>
           <w:tcPr>
-            <w:tcW w:type="dxa" w:w="4320"/>
+            <w:tcW w:type="dxa" w:w="4392"/>
           </w:tcPr>
           <w:p>
+            <w:r/>
             <w:r>
+              <w:rPr>
+                <w:b w:val="0"/>
+                <w:sz w:val="22"/>
+              </w:rPr>
               <w:t>Step 3</w:t>
             </w:r>
           </w:p>
         </w:tc>
         <w:tc>
           <w:tcPr>
-            <w:tcW w:type="dxa" w:w="4320"/>
+            <w:tcW w:type="dxa" w:w="4392"/>
           </w:tcPr>
           <w:p>
+            <w:r/>
             <w:r>
-              <w:t>Web Search node — DuckDuckGo text search + LLM synthesis</w:t>
+              <w:rPr>
+                <w:b w:val="0"/>
+                <w:sz w:val="22"/>
+              </w:rPr>
+              <w:t>Create ReAct agent with `create_react_agent` + `MemorySaver`</w:t>
             </w:r>
           </w:p>
         </w:tc>
@@ -537,21 +1250,31 @@
       <w:tr>
         <w:tc>
           <w:tcPr>
-            <w:tcW w:type="dxa" w:w="4320"/>
+            <w:tcW w:type="dxa" w:w="4392"/>
           </w:tcPr>
           <w:p>
+            <w:r/>
             <w:r>
+              <w:rPr>
+                <w:b w:val="0"/>
+                <w:sz w:val="22"/>
+              </w:rPr>
               <w:t>Step 4</w:t>
             </w:r>
           </w:p>
         </w:tc>
         <w:tc>
           <w:tcPr>
-            <w:tcW w:type="dxa" w:w="4320"/>
+            <w:tcW w:type="dxa" w:w="4392"/>
           </w:tcPr>
           <w:p>
+            <w:r/>
             <w:r>
-              <w:t>Chat node — GPT-4o-mini with conversation history</w:t>
+              <w:rPr>
+                <w:b w:val="0"/>
+                <w:sz w:val="22"/>
+              </w:rPr>
+              <w:t>7 sample scenarios (tech news, finance, topic search, CEO lookup, chat, multi-turn, categories)</w:t>
             </w:r>
           </w:p>
         </w:tc>
@@ -559,21 +1282,31 @@
       <w:tr>
         <w:tc>
           <w:tcPr>
-            <w:tcW w:type="dxa" w:w="4320"/>
+            <w:tcW w:type="dxa" w:w="4392"/>
           </w:tcPr>
           <w:p>
+            <w:r/>
             <w:r>
+              <w:rPr>
+                <w:b w:val="0"/>
+                <w:sz w:val="22"/>
+              </w:rPr>
               <w:t>Step 5</w:t>
             </w:r>
           </w:p>
         </w:tc>
         <w:tc>
           <w:tcPr>
-            <w:tcW w:type="dxa" w:w="4320"/>
+            <w:tcW w:type="dxa" w:w="4392"/>
           </w:tcPr>
           <w:p>
+            <w:r/>
             <w:r>
-              <w:t>Build and compile full LangGraph `StateGraph` workflow</w:t>
+              <w:rPr>
+                <w:b w:val="0"/>
+                <w:sz w:val="22"/>
+              </w:rPr>
+              <w:t>10 automated test cases — tool selection + response validation</w:t>
             </w:r>
           </w:p>
         </w:tc>
@@ -581,65 +1314,31 @@
       <w:tr>
         <w:tc>
           <w:tcPr>
-            <w:tcW w:type="dxa" w:w="4320"/>
+            <w:tcW w:type="dxa" w:w="4392"/>
           </w:tcPr>
           <w:p>
+            <w:r/>
             <w:r>
+              <w:rPr>
+                <w:b w:val="0"/>
+                <w:sz w:val="22"/>
+              </w:rPr>
               <w:t>Step 6</w:t>
             </w:r>
           </w:p>
         </w:tc>
         <w:tc>
           <w:tcPr>
-            <w:tcW w:type="dxa" w:w="4320"/>
+            <w:tcW w:type="dxa" w:w="4392"/>
           </w:tcPr>
           <w:p>
+            <w:r/>
             <w:r>
-              <w:t>6 sample scenarios (tech news, finance, sports, chat, search, multi-turn)</w:t>
-            </w:r>
-          </w:p>
-        </w:tc>
-      </w:tr>
-      <w:tr>
-        <w:tc>
-          <w:tcPr>
-            <w:tcW w:type="dxa" w:w="4320"/>
-          </w:tcPr>
-          <w:p>
-            <w:r>
-              <w:t>Step 7</w:t>
-            </w:r>
-          </w:p>
-        </w:tc>
-        <w:tc>
-          <w:tcPr>
-            <w:tcW w:type="dxa" w:w="4320"/>
-          </w:tcPr>
-          <w:p>
-            <w:r>
-              <w:t>10 automated test cases — routing + response validation</w:t>
-            </w:r>
-          </w:p>
-        </w:tc>
-      </w:tr>
-      <w:tr>
-        <w:tc>
-          <w:tcPr>
-            <w:tcW w:type="dxa" w:w="4320"/>
-          </w:tcPr>
-          <w:p>
-            <w:r>
-              <w:t>Step 8</w:t>
-            </w:r>
-          </w:p>
-        </w:tc>
-        <w:tc>
-          <w:tcPr>
-            <w:tcW w:type="dxa" w:w="4320"/>
-          </w:tcPr>
-          <w:p>
-            <w:r>
-              <w:t>3 visualisations (test results, category distribution, workflow diagram)</w:t>
+              <w:rPr>
+                <w:b w:val="0"/>
+                <w:sz w:val="22"/>
+              </w:rPr>
+              <w:t>2 visualisations (test results + agent architecture diagram)</w:t>
             </w:r>
           </w:p>
         </w:tc>
@@ -648,17 +1347,21 @@
     <w:p/>
     <w:p/>
     <w:p>
+      <w:pPr>
+        <w:spacing w:before="120" w:after="80"/>
+      </w:pPr>
       <w:r>
         <w:rPr>
           <w:b/>
           <w:color w:val="264653"/>
-          <w:sz w:val="26"/>
+          <w:sz w:val="24"/>
         </w:rPr>
         <w:t>Option B — Streamlit UI</w:t>
       </w:r>
     </w:p>
     <w:p>
       <w:pPr>
+        <w:spacing w:after="0"/>
         <w:ind w:left="576"/>
       </w:pPr>
       <w:r>
@@ -672,8 +1375,22 @@
     </w:p>
     <w:p/>
     <w:p>
+      <w:pPr>
+        <w:spacing w:after="40"/>
+      </w:pPr>
       <w:r>
-        <w:t>Open http://localhost:8501</w:t>
+        <w:rPr>
+          <w:b w:val="0"/>
+          <w:sz w:val="22"/>
+        </w:rPr>
+        <w:t xml:space="preserve">Open </w:t>
+      </w:r>
+      <w:r>
+        <w:rPr>
+          <w:b/>
+          <w:sz w:val="22"/>
+        </w:rPr>
+        <w:t>http://localhost:8501</w:t>
       </w:r>
     </w:p>
     <w:p/>
@@ -684,18 +1401,27 @@
         <w:tblLook w:firstColumn="1" w:firstRow="1" w:lastColumn="0" w:lastRow="0" w:noHBand="0" w:noVBand="1" w:val="04A0"/>
       </w:tblPr>
       <w:tblGrid>
-        <w:gridCol w:w="4320"/>
-        <w:gridCol w:w="4320"/>
+        <w:gridCol w:w="4392"/>
+        <w:gridCol w:w="4392"/>
       </w:tblGrid>
       <w:tr>
         <w:tc>
           <w:tcPr>
-            <w:tcW w:type="dxa" w:w="4320"/>
+            <w:tcW w:type="dxa" w:w="4392"/>
+            <w:shd w:val="clear" w:color="auto" w:fill="2E86AB"/>
           </w:tcPr>
           <w:p>
             <w:r>
               <w:rPr>
                 <w:b/>
+                <w:color w:val="FFFFFF"/>
+              </w:rPr>
+            </w:r>
+            <w:r>
+              <w:rPr>
+                <w:b/>
+                <w:color w:val="FFFFFF"/>
+                <w:sz w:val="22"/>
               </w:rPr>
               <w:t>Page</w:t>
             </w:r>
@@ -703,12 +1429,21 @@
         </w:tc>
         <w:tc>
           <w:tcPr>
-            <w:tcW w:type="dxa" w:w="4320"/>
+            <w:tcW w:type="dxa" w:w="4392"/>
+            <w:shd w:val="clear" w:color="auto" w:fill="2E86AB"/>
           </w:tcPr>
           <w:p>
             <w:r>
               <w:rPr>
                 <w:b/>
+                <w:color w:val="FFFFFF"/>
+              </w:rPr>
+            </w:r>
+            <w:r>
+              <w:rPr>
+                <w:b/>
+                <w:color w:val="FFFFFF"/>
+                <w:sz w:val="22"/>
               </w:rPr>
               <w:t>Description</w:t>
             </w:r>
@@ -718,21 +1453,31 @@
       <w:tr>
         <w:tc>
           <w:tcPr>
-            <w:tcW w:type="dxa" w:w="4320"/>
+            <w:tcW w:type="dxa" w:w="4392"/>
           </w:tcPr>
           <w:p>
+            <w:r/>
             <w:r>
-              <w:t>💬 Chat &amp; News</w:t>
+              <w:rPr>
+                <w:b w:val="0"/>
+                <w:sz w:val="22"/>
+              </w:rPr>
+              <w:t>💬 AI News Chat</w:t>
             </w:r>
           </w:p>
         </w:tc>
         <w:tc>
           <w:tcPr>
-            <w:tcW w:type="dxa" w:w="4320"/>
+            <w:tcW w:type="dxa" w:w="4392"/>
           </w:tcPr>
           <w:p>
+            <w:r/>
             <w:r>
-              <w:t>Main chat interface with route badge, article expander, quick buttons</w:t>
+              <w:rPr>
+                <w:b w:val="0"/>
+                <w:sz w:val="22"/>
+              </w:rPr>
+              <w:t>Main chat interface — agent shows which tools it called per response</w:t>
             </w:r>
           </w:p>
         </w:tc>
@@ -740,21 +1485,31 @@
       <w:tr>
         <w:tc>
           <w:tcPr>
-            <w:tcW w:type="dxa" w:w="4320"/>
+            <w:tcW w:type="dxa" w:w="4392"/>
           </w:tcPr>
           <w:p>
+            <w:r/>
             <w:r>
-              <w:t>📊 Dashboard</w:t>
+              <w:rPr>
+                <w:b w:val="0"/>
+                <w:sz w:val="22"/>
+              </w:rPr>
+              <w:t>📊 Quick Headlines</w:t>
             </w:r>
           </w:p>
         </w:tc>
         <w:tc>
           <w:tcPr>
-            <w:tcW w:type="dxa" w:w="4320"/>
+            <w:tcW w:type="dxa" w:w="4392"/>
           </w:tcPr>
           <w:p>
+            <w:r/>
             <w:r>
-              <w:t>LangGraph workflow diagram + category overview + session metrics</w:t>
+              <w:rPr>
+                <w:b w:val="0"/>
+                <w:sz w:val="22"/>
+              </w:rPr>
+              <w:t>One-click category buttons with active highlight + instant news fetch</w:t>
             </w:r>
           </w:p>
         </w:tc>
@@ -762,21 +1517,31 @@
       <w:tr>
         <w:tc>
           <w:tcPr>
-            <w:tcW w:type="dxa" w:w="4320"/>
+            <w:tcW w:type="dxa" w:w="4392"/>
           </w:tcPr>
           <w:p>
+            <w:r/>
             <w:r>
+              <w:rPr>
+                <w:b w:val="0"/>
+                <w:sz w:val="22"/>
+              </w:rPr>
               <w:t>🧪 Test Cases</w:t>
             </w:r>
           </w:p>
         </w:tc>
         <w:tc>
           <w:tcPr>
-            <w:tcW w:type="dxa" w:w="4320"/>
+            <w:tcW w:type="dxa" w:w="4392"/>
           </w:tcPr>
           <w:p>
+            <w:r/>
             <w:r>
-              <w:t>Run all 10 automated tests with colour-coded pass/fail table</w:t>
+              <w:rPr>
+                <w:b w:val="0"/>
+                <w:sz w:val="22"/>
+              </w:rPr>
+              <w:t>Run 10 automated tests with colour-coded pass/fail results</w:t>
             </w:r>
           </w:p>
         </w:tc>
@@ -785,305 +1550,28 @@
     <w:p/>
     <w:p/>
     <w:p>
-      <w:r>
-        <w:t>────────────────────────────────────────────────────────────</w:t>
-      </w:r>
-    </w:p>
-    <w:p/>
-    <w:p>
+      <w:pPr>
+        <w:spacing w:before="120"/>
+      </w:pPr>
       <w:r>
         <w:rPr>
-          <w:b/>
-          <w:color w:val="A23B72"/>
-          <w:sz w:val="32"/>
+          <w:color w:val="CCCCCC"/>
         </w:rPr>
-        <w:t>Architecture</w:t>
+        <w:t>─────────────────────────────────────────────────────────────────</w:t>
       </w:r>
     </w:p>
     <w:p/>
     <w:p>
       <w:pPr>
-        <w:ind w:left="576"/>
+        <w:spacing w:before="200" w:after="80"/>
       </w:pPr>
       <w:r>
         <w:rPr>
-          <w:rFonts w:ascii="Courier New" w:hAnsi="Courier New"/>
-          <w:color w:val="264653"/>
-          <w:sz w:val="18"/>
+          <w:b/>
+          <w:color w:val="A23B72"/>
+          <w:sz w:val="30"/>
         </w:rPr>
-        <w:t>User Query</w:t>
-      </w:r>
-    </w:p>
-    <w:p>
-      <w:pPr>
-        <w:ind w:left="576"/>
-      </w:pPr>
-      <w:r>
-        <w:rPr>
-          <w:rFonts w:ascii="Courier New" w:hAnsi="Courier New"/>
-          <w:color w:val="264653"/>
-          <w:sz w:val="18"/>
-        </w:rPr>
-        <w:t xml:space="preserve">    │</w:t>
-      </w:r>
-    </w:p>
-    <w:p>
-      <w:pPr>
-        <w:ind w:left="576"/>
-      </w:pPr>
-      <w:r>
-        <w:rPr>
-          <w:rFonts w:ascii="Courier New" w:hAnsi="Courier New"/>
-          <w:color w:val="264653"/>
-          <w:sz w:val="18"/>
-        </w:rPr>
-        <w:t xml:space="preserve">    ▼</w:t>
-      </w:r>
-    </w:p>
-    <w:p>
-      <w:pPr>
-        <w:ind w:left="576"/>
-      </w:pPr>
-      <w:r>
-        <w:rPr>
-          <w:rFonts w:ascii="Courier New" w:hAnsi="Courier New"/>
-          <w:color w:val="264653"/>
-          <w:sz w:val="18"/>
-        </w:rPr>
-        <w:t>┌──────────────────────────────────────┐</w:t>
-      </w:r>
-    </w:p>
-    <w:p>
-      <w:pPr>
-        <w:ind w:left="576"/>
-      </w:pPr>
-      <w:r>
-        <w:rPr>
-          <w:rFonts w:ascii="Courier New" w:hAnsi="Courier New"/>
-          <w:color w:val="264653"/>
-          <w:sz w:val="18"/>
-        </w:rPr>
-        <w:t>│         LangGraph StateGraph         │</w:t>
-      </w:r>
-    </w:p>
-    <w:p>
-      <w:pPr>
-        <w:ind w:left="576"/>
-      </w:pPr>
-      <w:r>
-        <w:rPr>
-          <w:rFonts w:ascii="Courier New" w:hAnsi="Courier New"/>
-          <w:color w:val="264653"/>
-          <w:sz w:val="18"/>
-        </w:rPr>
-        <w:t>│                                      │</w:t>
-      </w:r>
-    </w:p>
-    <w:p>
-      <w:pPr>
-        <w:ind w:left="576"/>
-      </w:pPr>
-      <w:r>
-        <w:rPr>
-          <w:rFonts w:ascii="Courier New" w:hAnsi="Courier New"/>
-          <w:color w:val="264653"/>
-          <w:sz w:val="18"/>
-        </w:rPr>
-        <w:t>│  [Router Node] ← LLM intent detect  │</w:t>
-      </w:r>
-    </w:p>
-    <w:p>
-      <w:pPr>
-        <w:ind w:left="576"/>
-      </w:pPr>
-      <w:r>
-        <w:rPr>
-          <w:rFonts w:ascii="Courier New" w:hAnsi="Courier New"/>
-          <w:color w:val="264653"/>
-          <w:sz w:val="18"/>
-        </w:rPr>
-        <w:t>│       │                              │</w:t>
-      </w:r>
-    </w:p>
-    <w:p>
-      <w:pPr>
-        <w:ind w:left="576"/>
-      </w:pPr>
-      <w:r>
-        <w:rPr>
-          <w:rFonts w:ascii="Courier New" w:hAnsi="Courier New"/>
-          <w:color w:val="264653"/>
-          <w:sz w:val="18"/>
-        </w:rPr>
-        <w:t>│  ┌────┴────────────────┐             │</w:t>
-      </w:r>
-    </w:p>
-    <w:p>
-      <w:pPr>
-        <w:ind w:left="576"/>
-      </w:pPr>
-      <w:r>
-        <w:rPr>
-          <w:rFonts w:ascii="Courier New" w:hAnsi="Courier New"/>
-          <w:color w:val="264653"/>
-          <w:sz w:val="18"/>
-        </w:rPr>
-        <w:t>│  │         │           │             │</w:t>
-      </w:r>
-    </w:p>
-    <w:p>
-      <w:pPr>
-        <w:ind w:left="576"/>
-      </w:pPr>
-      <w:r>
-        <w:rPr>
-          <w:rFonts w:ascii="Courier New" w:hAnsi="Courier New"/>
-          <w:color w:val="264653"/>
-          <w:sz w:val="18"/>
-        </w:rPr>
-        <w:t>│ [News]  [Search]    [Chat]           │</w:t>
-      </w:r>
-    </w:p>
-    <w:p>
-      <w:pPr>
-        <w:ind w:left="576"/>
-      </w:pPr>
-      <w:r>
-        <w:rPr>
-          <w:rFonts w:ascii="Courier New" w:hAnsi="Courier New"/>
-          <w:color w:val="264653"/>
-          <w:sz w:val="18"/>
-        </w:rPr>
-        <w:t>│  │         │           │             │</w:t>
-      </w:r>
-    </w:p>
-    <w:p>
-      <w:pPr>
-        <w:ind w:left="576"/>
-      </w:pPr>
-      <w:r>
-        <w:rPr>
-          <w:rFonts w:ascii="Courier New" w:hAnsi="Courier New"/>
-          <w:color w:val="264653"/>
-          <w:sz w:val="18"/>
-        </w:rPr>
-        <w:t>│  └────┬────┴───────────┘             │</w:t>
-      </w:r>
-    </w:p>
-    <w:p>
-      <w:pPr>
-        <w:ind w:left="576"/>
-      </w:pPr>
-      <w:r>
-        <w:rPr>
-          <w:rFonts w:ascii="Courier New" w:hAnsi="Courier New"/>
-          <w:color w:val="264653"/>
-          <w:sz w:val="18"/>
-        </w:rPr>
-        <w:t>│       │                              │</w:t>
-      </w:r>
-    </w:p>
-    <w:p>
-      <w:pPr>
-        <w:ind w:left="576"/>
-      </w:pPr>
-      <w:r>
-        <w:rPr>
-          <w:rFonts w:ascii="Courier New" w:hAnsi="Courier New"/>
-          <w:color w:val="264653"/>
-          <w:sz w:val="18"/>
-        </w:rPr>
-        <w:t>│  [Formatter Node] ← assemble output │</w:t>
-      </w:r>
-    </w:p>
-    <w:p>
-      <w:pPr>
-        <w:ind w:left="576"/>
-      </w:pPr>
-      <w:r>
-        <w:rPr>
-          <w:rFonts w:ascii="Courier New" w:hAnsi="Courier New"/>
-          <w:color w:val="264653"/>
-          <w:sz w:val="18"/>
-        </w:rPr>
-        <w:t>│       │                              │</w:t>
-      </w:r>
-    </w:p>
-    <w:p>
-      <w:pPr>
-        <w:ind w:left="576"/>
-      </w:pPr>
-      <w:r>
-        <w:rPr>
-          <w:rFonts w:ascii="Courier New" w:hAnsi="Courier New"/>
-          <w:color w:val="264653"/>
-          <w:sz w:val="18"/>
-        </w:rPr>
-        <w:t>│  [MemorySaver] ← session memory     │</w:t>
-      </w:r>
-    </w:p>
-    <w:p>
-      <w:pPr>
-        <w:ind w:left="576"/>
-      </w:pPr>
-      <w:r>
-        <w:rPr>
-          <w:rFonts w:ascii="Courier New" w:hAnsi="Courier New"/>
-          <w:color w:val="264653"/>
-          <w:sz w:val="18"/>
-        </w:rPr>
-        <w:t>└──────────────────────────────────────┘</w:t>
-      </w:r>
-    </w:p>
-    <w:p>
-      <w:pPr>
-        <w:ind w:left="576"/>
-      </w:pPr>
-      <w:r>
-        <w:rPr>
-          <w:rFonts w:ascii="Courier New" w:hAnsi="Courier New"/>
-          <w:color w:val="264653"/>
-          <w:sz w:val="18"/>
-        </w:rPr>
-        <w:t xml:space="preserve">    │</w:t>
-      </w:r>
-    </w:p>
-    <w:p>
-      <w:pPr>
-        <w:ind w:left="576"/>
-      </w:pPr>
-      <w:r>
-        <w:rPr>
-          <w:rFonts w:ascii="Courier New" w:hAnsi="Courier New"/>
-          <w:color w:val="264653"/>
-          <w:sz w:val="18"/>
-        </w:rPr>
-        <w:t xml:space="preserve">    ▼</w:t>
-      </w:r>
-    </w:p>
-    <w:p>
-      <w:pPr>
-        <w:ind w:left="576"/>
-      </w:pPr>
-      <w:r>
-        <w:rPr>
-          <w:rFonts w:ascii="Courier New" w:hAnsi="Courier New"/>
-          <w:color w:val="264653"/>
-          <w:sz w:val="18"/>
-        </w:rPr>
-        <w:t>Final Response to User</w:t>
-      </w:r>
-    </w:p>
-    <w:p/>
-    <w:p/>
-    <w:p>
-      <w:r>
-        <w:rPr>
-          <w:b/>
-          <w:color w:val="264653"/>
-          <w:sz w:val="26"/>
-        </w:rPr>
-        <w:t>Query Routing Logic</w:t>
+        <w:t>Tools</w:t>
       </w:r>
     </w:p>
     <w:p/>
@@ -1094,47 +1582,74 @@
         <w:tblLook w:firstColumn="1" w:firstRow="1" w:lastColumn="0" w:lastRow="0" w:noHBand="0" w:noVBand="1" w:val="04A0"/>
       </w:tblPr>
       <w:tblGrid>
-        <w:gridCol w:w="2880"/>
-        <w:gridCol w:w="2880"/>
-        <w:gridCol w:w="2880"/>
+        <w:gridCol w:w="2928"/>
+        <w:gridCol w:w="2928"/>
+        <w:gridCol w:w="2928"/>
       </w:tblGrid>
       <w:tr>
         <w:tc>
           <w:tcPr>
-            <w:tcW w:type="dxa" w:w="2880"/>
+            <w:tcW w:type="dxa" w:w="2928"/>
+            <w:shd w:val="clear" w:color="auto" w:fill="2E86AB"/>
           </w:tcPr>
           <w:p>
             <w:r>
               <w:rPr>
                 <w:b/>
+                <w:color w:val="FFFFFF"/>
               </w:rPr>
-              <w:t>Query Example</w:t>
+            </w:r>
+            <w:r>
+              <w:rPr>
+                <w:b/>
+                <w:color w:val="FFFFFF"/>
+                <w:sz w:val="22"/>
+              </w:rPr>
+              <w:t>Tool</w:t>
             </w:r>
           </w:p>
         </w:tc>
         <w:tc>
           <w:tcPr>
-            <w:tcW w:type="dxa" w:w="2880"/>
+            <w:tcW w:type="dxa" w:w="2928"/>
+            <w:shd w:val="clear" w:color="auto" w:fill="2E86AB"/>
           </w:tcPr>
           <w:p>
             <w:r>
               <w:rPr>
                 <w:b/>
+                <w:color w:val="FFFFFF"/>
               </w:rPr>
-              <w:t>Classified As</w:t>
+            </w:r>
+            <w:r>
+              <w:rPr>
+                <w:b/>
+                <w:color w:val="FFFFFF"/>
+                <w:sz w:val="22"/>
+              </w:rPr>
+              <w:t>Trigger</w:t>
             </w:r>
           </w:p>
         </w:tc>
         <w:tc>
           <w:tcPr>
-            <w:tcW w:type="dxa" w:w="2880"/>
+            <w:tcW w:type="dxa" w:w="2928"/>
+            <w:shd w:val="clear" w:color="auto" w:fill="2E86AB"/>
           </w:tcPr>
           <w:p>
             <w:r>
               <w:rPr>
                 <w:b/>
+                <w:color w:val="FFFFFF"/>
               </w:rPr>
-              <w:t>Handler</w:t>
+            </w:r>
+            <w:r>
+              <w:rPr>
+                <w:b/>
+                <w:color w:val="FFFFFF"/>
+                <w:sz w:val="22"/>
+              </w:rPr>
+              <w:t>Data Source</w:t>
             </w:r>
           </w:p>
         </w:tc>
@@ -1142,31 +1657,46 @@
       <w:tr>
         <w:tc>
           <w:tcPr>
-            <w:tcW w:type="dxa" w:w="2880"/>
+            <w:tcW w:type="dxa" w:w="2928"/>
           </w:tcPr>
           <w:p>
+            <w:r/>
             <w:r>
-              <w:t>"Latest tech news today"</w:t>
+              <w:rPr>
+                <w:b w:val="0"/>
+                <w:sz w:val="22"/>
+              </w:rPr>
+              <w:t>`get_top_headlines(category)`</w:t>
             </w:r>
           </w:p>
         </w:tc>
         <w:tc>
           <w:tcPr>
-            <w:tcW w:type="dxa" w:w="2880"/>
+            <w:tcW w:type="dxa" w:w="2928"/>
           </w:tcPr>
           <w:p>
+            <w:r/>
             <w:r>
-              <w:t>`news` → technology</w:t>
+              <w:rPr>
+                <w:b w:val="0"/>
+                <w:sz w:val="22"/>
+              </w:rPr>
+              <w:t>"latest tech news", "top sports headlines"</w:t>
             </w:r>
           </w:p>
         </w:tc>
         <w:tc>
           <w:tcPr>
-            <w:tcW w:type="dxa" w:w="2880"/>
+            <w:tcW w:type="dxa" w:w="2928"/>
           </w:tcPr>
           <w:p>
+            <w:r/>
             <w:r>
-              <w:t>News Node</w:t>
+              <w:rPr>
+                <w:b w:val="0"/>
+                <w:sz w:val="22"/>
+              </w:rPr>
+              <w:t>NewsAPI / DuckDuckGo News</w:t>
             </w:r>
           </w:p>
         </w:tc>
@@ -1174,31 +1704,46 @@
       <w:tr>
         <w:tc>
           <w:tcPr>
-            <w:tcW w:type="dxa" w:w="2880"/>
+            <w:tcW w:type="dxa" w:w="2928"/>
           </w:tcPr>
           <w:p>
+            <w:r/>
             <w:r>
-              <w:t>"Top finance headlines"</w:t>
+              <w:rPr>
+                <w:b w:val="0"/>
+                <w:sz w:val="22"/>
+              </w:rPr>
+              <w:t>`search_news(query)`</w:t>
             </w:r>
           </w:p>
         </w:tc>
         <w:tc>
           <w:tcPr>
-            <w:tcW w:type="dxa" w:w="2880"/>
+            <w:tcW w:type="dxa" w:w="2928"/>
           </w:tcPr>
           <w:p>
+            <w:r/>
             <w:r>
-              <w:t>`news` → finance</w:t>
+              <w:rPr>
+                <w:b w:val="0"/>
+                <w:sz w:val="22"/>
+              </w:rPr>
+              <w:t>"news about Tesla", "OpenAI recent news"</w:t>
             </w:r>
           </w:p>
         </w:tc>
         <w:tc>
           <w:tcPr>
-            <w:tcW w:type="dxa" w:w="2880"/>
+            <w:tcW w:type="dxa" w:w="2928"/>
           </w:tcPr>
           <w:p>
+            <w:r/>
             <w:r>
-              <w:t>News Node</w:t>
+              <w:rPr>
+                <w:b w:val="0"/>
+                <w:sz w:val="22"/>
+              </w:rPr>
+              <w:t>NewsAPI / DuckDuckGo News</w:t>
             </w:r>
           </w:p>
         </w:tc>
@@ -1206,31 +1751,46 @@
       <w:tr>
         <w:tc>
           <w:tcPr>
-            <w:tcW w:type="dxa" w:w="2880"/>
+            <w:tcW w:type="dxa" w:w="2928"/>
           </w:tcPr>
           <w:p>
+            <w:r/>
             <w:r>
-              <w:t>"What is machine learning?"</w:t>
+              <w:rPr>
+                <w:b w:val="0"/>
+                <w:sz w:val="22"/>
+              </w:rPr>
+              <w:t>`search_web(query)`</w:t>
             </w:r>
           </w:p>
         </w:tc>
         <w:tc>
           <w:tcPr>
-            <w:tcW w:type="dxa" w:w="2880"/>
+            <w:tcW w:type="dxa" w:w="2928"/>
           </w:tcPr>
           <w:p>
+            <w:r/>
             <w:r>
-              <w:t>`chat` → general</w:t>
+              <w:rPr>
+                <w:b w:val="0"/>
+                <w:sz w:val="22"/>
+              </w:rPr>
+              <w:t>"who is CEO of Apple", "Bitcoin price"</w:t>
             </w:r>
           </w:p>
         </w:tc>
         <w:tc>
           <w:tcPr>
-            <w:tcW w:type="dxa" w:w="2880"/>
+            <w:tcW w:type="dxa" w:w="2928"/>
           </w:tcPr>
           <w:p>
+            <w:r/>
             <w:r>
-              <w:t>Chat Node</w:t>
+              <w:rPr>
+                <w:b w:val="0"/>
+                <w:sz w:val="22"/>
+              </w:rPr>
+              <w:t>DuckDuckGo Web Search</w:t>
             </w:r>
           </w:p>
         </w:tc>
@@ -1238,31 +1798,46 @@
       <w:tr>
         <w:tc>
           <w:tcPr>
-            <w:tcW w:type="dxa" w:w="2880"/>
+            <w:tcW w:type="dxa" w:w="2928"/>
           </w:tcPr>
           <w:p>
+            <w:r/>
             <w:r>
-              <w:t>"Current Bitcoin price?"</w:t>
+              <w:rPr>
+                <w:b w:val="0"/>
+                <w:sz w:val="22"/>
+              </w:rPr>
+              <w:t>`get_weather(location)`</w:t>
             </w:r>
           </w:p>
         </w:tc>
         <w:tc>
           <w:tcPr>
-            <w:tcW w:type="dxa" w:w="2880"/>
+            <w:tcW w:type="dxa" w:w="2928"/>
           </w:tcPr>
           <w:p>
+            <w:r/>
             <w:r>
-              <w:t>`search` → finance</w:t>
+              <w:rPr>
+                <w:b w:val="0"/>
+                <w:sz w:val="22"/>
+              </w:rPr>
+              <w:t>"weather in London", "will it rain in Chicago?"</w:t>
             </w:r>
           </w:p>
         </w:tc>
         <w:tc>
           <w:tcPr>
-            <w:tcW w:type="dxa" w:w="2880"/>
+            <w:tcW w:type="dxa" w:w="2928"/>
           </w:tcPr>
           <w:p>
+            <w:r/>
             <w:r>
-              <w:t>Search Node</w:t>
+              <w:rPr>
+                <w:b w:val="0"/>
+                <w:sz w:val="22"/>
+              </w:rPr>
+              <w:t>Open-Meteo (free, no key)</w:t>
             </w:r>
           </w:p>
         </w:tc>
@@ -1270,31 +1845,46 @@
       <w:tr>
         <w:tc>
           <w:tcPr>
-            <w:tcW w:type="dxa" w:w="2880"/>
+            <w:tcW w:type="dxa" w:w="2928"/>
           </w:tcPr>
           <w:p>
+            <w:r/>
             <w:r>
-              <w:t>"Summarise what you told me"</w:t>
+              <w:rPr>
+                <w:b w:val="0"/>
+                <w:sz w:val="22"/>
+              </w:rPr>
+              <w:t>`get_news_categories()`</w:t>
             </w:r>
           </w:p>
         </w:tc>
         <w:tc>
           <w:tcPr>
-            <w:tcW w:type="dxa" w:w="2880"/>
+            <w:tcW w:type="dxa" w:w="2928"/>
           </w:tcPr>
           <w:p>
+            <w:r/>
             <w:r>
-              <w:t>`chat` → general</w:t>
+              <w:rPr>
+                <w:b w:val="0"/>
+                <w:sz w:val="22"/>
+              </w:rPr>
+              <w:t>"what categories do you support?"</w:t>
             </w:r>
           </w:p>
         </w:tc>
         <w:tc>
           <w:tcPr>
-            <w:tcW w:type="dxa" w:w="2880"/>
+            <w:tcW w:type="dxa" w:w="2928"/>
           </w:tcPr>
           <w:p>
+            <w:r/>
             <w:r>
-              <w:t>Chat Node (with memory)</w:t>
+              <w:rPr>
+                <w:b w:val="0"/>
+                <w:sz w:val="22"/>
+              </w:rPr>
+              <w:t>Built-in</w:t>
             </w:r>
           </w:p>
         </w:tc>
@@ -1303,11 +1893,463 @@
     <w:p/>
     <w:p/>
     <w:p>
+      <w:pPr>
+        <w:spacing w:before="120"/>
+      </w:pPr>
+      <w:r>
+        <w:rPr>
+          <w:color w:val="CCCCCC"/>
+        </w:rPr>
+        <w:t>─────────────────────────────────────────────────────────────────</w:t>
+      </w:r>
+    </w:p>
+    <w:p/>
+    <w:p>
+      <w:pPr>
+        <w:spacing w:before="200" w:after="80"/>
+      </w:pPr>
       <w:r>
         <w:rPr>
           <w:b/>
-          <w:color w:val="264653"/>
-          <w:sz w:val="26"/>
+          <w:color w:val="A23B72"/>
+          <w:sz w:val="30"/>
+        </w:rPr>
+        <w:t>Query Examples</w:t>
+      </w:r>
+    </w:p>
+    <w:p/>
+    <w:tbl>
+      <w:tblPr>
+        <w:tblStyle w:val="TableGrid"/>
+        <w:tblW w:type="auto" w:w="0"/>
+        <w:tblLook w:firstColumn="1" w:firstRow="1" w:lastColumn="0" w:lastRow="0" w:noHBand="0" w:noVBand="1" w:val="04A0"/>
+      </w:tblPr>
+      <w:tblGrid>
+        <w:gridCol w:w="2928"/>
+        <w:gridCol w:w="2928"/>
+        <w:gridCol w:w="2928"/>
+      </w:tblGrid>
+      <w:tr>
+        <w:tc>
+          <w:tcPr>
+            <w:tcW w:type="dxa" w:w="2928"/>
+            <w:shd w:val="clear" w:color="auto" w:fill="2E86AB"/>
+          </w:tcPr>
+          <w:p>
+            <w:r>
+              <w:rPr>
+                <w:b/>
+                <w:color w:val="FFFFFF"/>
+              </w:rPr>
+            </w:r>
+            <w:r>
+              <w:rPr>
+                <w:b/>
+                <w:color w:val="FFFFFF"/>
+                <w:sz w:val="22"/>
+              </w:rPr>
+              <w:t>User Query</w:t>
+            </w:r>
+          </w:p>
+        </w:tc>
+        <w:tc>
+          <w:tcPr>
+            <w:tcW w:type="dxa" w:w="2928"/>
+            <w:shd w:val="clear" w:color="auto" w:fill="2E86AB"/>
+          </w:tcPr>
+          <w:p>
+            <w:r>
+              <w:rPr>
+                <w:b/>
+                <w:color w:val="FFFFFF"/>
+              </w:rPr>
+            </w:r>
+            <w:r>
+              <w:rPr>
+                <w:b/>
+                <w:color w:val="FFFFFF"/>
+                <w:sz w:val="22"/>
+              </w:rPr>
+              <w:t>Tool Called</w:t>
+            </w:r>
+          </w:p>
+        </w:tc>
+        <w:tc>
+          <w:tcPr>
+            <w:tcW w:type="dxa" w:w="2928"/>
+            <w:shd w:val="clear" w:color="auto" w:fill="2E86AB"/>
+          </w:tcPr>
+          <w:p>
+            <w:r>
+              <w:rPr>
+                <w:b/>
+                <w:color w:val="FFFFFF"/>
+              </w:rPr>
+            </w:r>
+            <w:r>
+              <w:rPr>
+                <w:b/>
+                <w:color w:val="FFFFFF"/>
+                <w:sz w:val="22"/>
+              </w:rPr>
+              <w:t>Result</w:t>
+            </w:r>
+          </w:p>
+        </w:tc>
+      </w:tr>
+      <w:tr>
+        <w:tc>
+          <w:tcPr>
+            <w:tcW w:type="dxa" w:w="2928"/>
+          </w:tcPr>
+          <w:p>
+            <w:r/>
+            <w:r>
+              <w:rPr>
+                <w:b w:val="0"/>
+                <w:sz w:val="22"/>
+              </w:rPr>
+              <w:t>"Latest technology news today"</w:t>
+            </w:r>
+          </w:p>
+        </w:tc>
+        <w:tc>
+          <w:tcPr>
+            <w:tcW w:type="dxa" w:w="2928"/>
+          </w:tcPr>
+          <w:p>
+            <w:r/>
+            <w:r>
+              <w:rPr>
+                <w:b w:val="0"/>
+                <w:sz w:val="22"/>
+              </w:rPr>
+              <w:t>`get_top_headlines("technology")`</w:t>
+            </w:r>
+          </w:p>
+        </w:tc>
+        <w:tc>
+          <w:tcPr>
+            <w:tcW w:type="dxa" w:w="2928"/>
+          </w:tcPr>
+          <w:p>
+            <w:r/>
+            <w:r>
+              <w:rPr>
+                <w:b w:val="0"/>
+                <w:sz w:val="22"/>
+              </w:rPr>
+              <w:t>Top tech headlines</w:t>
+            </w:r>
+          </w:p>
+        </w:tc>
+      </w:tr>
+      <w:tr>
+        <w:tc>
+          <w:tcPr>
+            <w:tcW w:type="dxa" w:w="2928"/>
+          </w:tcPr>
+          <w:p>
+            <w:r/>
+            <w:r>
+              <w:rPr>
+                <w:b w:val="0"/>
+                <w:sz w:val="22"/>
+              </w:rPr>
+              <w:t>"Top sports headlines"</w:t>
+            </w:r>
+          </w:p>
+        </w:tc>
+        <w:tc>
+          <w:tcPr>
+            <w:tcW w:type="dxa" w:w="2928"/>
+          </w:tcPr>
+          <w:p>
+            <w:r/>
+            <w:r>
+              <w:rPr>
+                <w:b w:val="0"/>
+                <w:sz w:val="22"/>
+              </w:rPr>
+              <w:t>`get_top_headlines("sports")`</w:t>
+            </w:r>
+          </w:p>
+        </w:tc>
+        <w:tc>
+          <w:tcPr>
+            <w:tcW w:type="dxa" w:w="2928"/>
+          </w:tcPr>
+          <w:p>
+            <w:r/>
+            <w:r>
+              <w:rPr>
+                <w:b w:val="0"/>
+                <w:sz w:val="22"/>
+              </w:rPr>
+              <w:t>Sports stories</w:t>
+            </w:r>
+          </w:p>
+        </w:tc>
+      </w:tr>
+      <w:tr>
+        <w:tc>
+          <w:tcPr>
+            <w:tcW w:type="dxa" w:w="2928"/>
+          </w:tcPr>
+          <w:p>
+            <w:r/>
+            <w:r>
+              <w:rPr>
+                <w:b w:val="0"/>
+                <w:sz w:val="22"/>
+              </w:rPr>
+              <w:t>"Search for news about OpenAI"</w:t>
+            </w:r>
+          </w:p>
+        </w:tc>
+        <w:tc>
+          <w:tcPr>
+            <w:tcW w:type="dxa" w:w="2928"/>
+          </w:tcPr>
+          <w:p>
+            <w:r/>
+            <w:r>
+              <w:rPr>
+                <w:b w:val="0"/>
+                <w:sz w:val="22"/>
+              </w:rPr>
+              <w:t>`search_news("OpenAI recent news")`</w:t>
+            </w:r>
+          </w:p>
+        </w:tc>
+        <w:tc>
+          <w:tcPr>
+            <w:tcW w:type="dxa" w:w="2928"/>
+          </w:tcPr>
+          <w:p>
+            <w:r/>
+            <w:r>
+              <w:rPr>
+                <w:b w:val="0"/>
+                <w:sz w:val="22"/>
+              </w:rPr>
+              <w:t>OpenAI articles</w:t>
+            </w:r>
+          </w:p>
+        </w:tc>
+      </w:tr>
+      <w:tr>
+        <w:tc>
+          <w:tcPr>
+            <w:tcW w:type="dxa" w:w="2928"/>
+          </w:tcPr>
+          <w:p>
+            <w:r/>
+            <w:r>
+              <w:rPr>
+                <w:b w:val="0"/>
+                <w:sz w:val="22"/>
+              </w:rPr>
+              <w:t>"Who is the CEO of Microsoft?"</w:t>
+            </w:r>
+          </w:p>
+        </w:tc>
+        <w:tc>
+          <w:tcPr>
+            <w:tcW w:type="dxa" w:w="2928"/>
+          </w:tcPr>
+          <w:p>
+            <w:r/>
+            <w:r>
+              <w:rPr>
+                <w:b w:val="0"/>
+                <w:sz w:val="22"/>
+              </w:rPr>
+              <w:t>`search_web("CEO of Microsoft")`</w:t>
+            </w:r>
+          </w:p>
+        </w:tc>
+        <w:tc>
+          <w:tcPr>
+            <w:tcW w:type="dxa" w:w="2928"/>
+          </w:tcPr>
+          <w:p>
+            <w:r/>
+            <w:r>
+              <w:rPr>
+                <w:b w:val="0"/>
+                <w:sz w:val="22"/>
+              </w:rPr>
+              <w:t>Satya Nadella</w:t>
+            </w:r>
+          </w:p>
+        </w:tc>
+      </w:tr>
+      <w:tr>
+        <w:tc>
+          <w:tcPr>
+            <w:tcW w:type="dxa" w:w="2928"/>
+          </w:tcPr>
+          <w:p>
+            <w:r/>
+            <w:r>
+              <w:rPr>
+                <w:b w:val="0"/>
+                <w:sz w:val="22"/>
+              </w:rPr>
+              <w:t>"Weather in Aurora, Illinois"</w:t>
+            </w:r>
+          </w:p>
+        </w:tc>
+        <w:tc>
+          <w:tcPr>
+            <w:tcW w:type="dxa" w:w="2928"/>
+          </w:tcPr>
+          <w:p>
+            <w:r/>
+            <w:r>
+              <w:rPr>
+                <w:b w:val="0"/>
+                <w:sz w:val="22"/>
+              </w:rPr>
+              <w:t>`get_weather("Aurora, Illinois")`</w:t>
+            </w:r>
+          </w:p>
+        </w:tc>
+        <w:tc>
+          <w:tcPr>
+            <w:tcW w:type="dxa" w:w="2928"/>
+          </w:tcPr>
+          <w:p>
+            <w:r/>
+            <w:r>
+              <w:rPr>
+                <w:b w:val="0"/>
+                <w:sz w:val="22"/>
+              </w:rPr>
+              <w:t>Current + 3-day forecast</w:t>
+            </w:r>
+          </w:p>
+        </w:tc>
+      </w:tr>
+      <w:tr>
+        <w:tc>
+          <w:tcPr>
+            <w:tcW w:type="dxa" w:w="2928"/>
+          </w:tcPr>
+          <w:p>
+            <w:r/>
+            <w:r>
+              <w:rPr>
+                <w:b w:val="0"/>
+                <w:sz w:val="22"/>
+              </w:rPr>
+              <w:t>"What is machine learning?"</w:t>
+            </w:r>
+          </w:p>
+        </w:tc>
+        <w:tc>
+          <w:tcPr>
+            <w:tcW w:type="dxa" w:w="2928"/>
+          </w:tcPr>
+          <w:p>
+            <w:r/>
+            <w:r>
+              <w:rPr>
+                <w:b w:val="0"/>
+                <w:sz w:val="22"/>
+              </w:rPr>
+              <w:t>*(no tool — LLM answers directly)*</w:t>
+            </w:r>
+          </w:p>
+        </w:tc>
+        <w:tc>
+          <w:tcPr>
+            <w:tcW w:type="dxa" w:w="2928"/>
+          </w:tcPr>
+          <w:p>
+            <w:r/>
+            <w:r>
+              <w:rPr>
+                <w:b w:val="0"/>
+                <w:sz w:val="22"/>
+              </w:rPr>
+              <w:t>Explanation</w:t>
+            </w:r>
+          </w:p>
+        </w:tc>
+      </w:tr>
+      <w:tr>
+        <w:tc>
+          <w:tcPr>
+            <w:tcW w:type="dxa" w:w="2928"/>
+          </w:tcPr>
+          <w:p>
+            <w:r/>
+            <w:r>
+              <w:rPr>
+                <w:b w:val="0"/>
+                <w:sz w:val="22"/>
+              </w:rPr>
+              <w:t>"Which story was most important?"</w:t>
+            </w:r>
+          </w:p>
+        </w:tc>
+        <w:tc>
+          <w:tcPr>
+            <w:tcW w:type="dxa" w:w="2928"/>
+          </w:tcPr>
+          <w:p>
+            <w:r/>
+            <w:r>
+              <w:rPr>
+                <w:b w:val="0"/>
+                <w:sz w:val="22"/>
+              </w:rPr>
+              <w:t>*(no tool — uses conversation memory)*</w:t>
+            </w:r>
+          </w:p>
+        </w:tc>
+        <w:tc>
+          <w:tcPr>
+            <w:tcW w:type="dxa" w:w="2928"/>
+          </w:tcPr>
+          <w:p>
+            <w:r/>
+            <w:r>
+              <w:rPr>
+                <w:b w:val="0"/>
+                <w:sz w:val="22"/>
+              </w:rPr>
+              <w:t>Follow-up answer</w:t>
+            </w:r>
+          </w:p>
+        </w:tc>
+      </w:tr>
+    </w:tbl>
+    <w:p/>
+    <w:p/>
+    <w:p>
+      <w:pPr>
+        <w:spacing w:before="120"/>
+      </w:pPr>
+      <w:r>
+        <w:rPr>
+          <w:color w:val="CCCCCC"/>
+        </w:rPr>
+        <w:t>─────────────────────────────────────────────────────────────────</w:t>
+      </w:r>
+    </w:p>
+    <w:p/>
+    <w:p>
+      <w:pPr>
+        <w:spacing w:before="200" w:after="80"/>
+      </w:pPr>
+      <w:r>
+        <w:rPr>
+          <w:b/>
+          <w:color w:val="A23B72"/>
+          <w:sz w:val="30"/>
         </w:rPr>
         <w:t>Fallback Mechanisms</w:t>
       </w:r>
@@ -1320,33 +2362,51 @@
         <w:tblLook w:firstColumn="1" w:firstRow="1" w:lastColumn="0" w:lastRow="0" w:noHBand="0" w:noVBand="1" w:val="04A0"/>
       </w:tblPr>
       <w:tblGrid>
-        <w:gridCol w:w="4320"/>
-        <w:gridCol w:w="4320"/>
+        <w:gridCol w:w="4392"/>
+        <w:gridCol w:w="4392"/>
       </w:tblGrid>
       <w:tr>
         <w:tc>
           <w:tcPr>
-            <w:tcW w:type="dxa" w:w="4320"/>
+            <w:tcW w:type="dxa" w:w="4392"/>
+            <w:shd w:val="clear" w:color="auto" w:fill="2E86AB"/>
           </w:tcPr>
           <w:p>
             <w:r>
               <w:rPr>
                 <w:b/>
+                <w:color w:val="FFFFFF"/>
               </w:rPr>
-              <w:t>Failure</w:t>
+            </w:r>
+            <w:r>
+              <w:rPr>
+                <w:b/>
+                <w:color w:val="FFFFFF"/>
+                <w:sz w:val="22"/>
+              </w:rPr>
+              <w:t>Scenario</w:t>
             </w:r>
           </w:p>
         </w:tc>
         <w:tc>
           <w:tcPr>
-            <w:tcW w:type="dxa" w:w="4320"/>
+            <w:tcW w:type="dxa" w:w="4392"/>
+            <w:shd w:val="clear" w:color="auto" w:fill="2E86AB"/>
           </w:tcPr>
           <w:p>
             <w:r>
               <w:rPr>
                 <w:b/>
+                <w:color w:val="FFFFFF"/>
               </w:rPr>
-              <w:t>Fallback</w:t>
+            </w:r>
+            <w:r>
+              <w:rPr>
+                <w:b/>
+                <w:color w:val="FFFFFF"/>
+                <w:sz w:val="22"/>
+              </w:rPr>
+              <w:t>Behaviour</w:t>
             </w:r>
           </w:p>
         </w:tc>
@@ -1354,21 +2414,31 @@
       <w:tr>
         <w:tc>
           <w:tcPr>
-            <w:tcW w:type="dxa" w:w="4320"/>
+            <w:tcW w:type="dxa" w:w="4392"/>
           </w:tcPr>
           <w:p>
+            <w:r/>
             <w:r>
-              <w:t>NewsAPI unavailable / no key</w:t>
+              <w:rPr>
+                <w:b w:val="0"/>
+                <w:sz w:val="22"/>
+              </w:rPr>
+              <w:t>No `NEWSAPI_KEY`</w:t>
             </w:r>
           </w:p>
         </w:tc>
         <w:tc>
           <w:tcPr>
-            <w:tcW w:type="dxa" w:w="4320"/>
+            <w:tcW w:type="dxa" w:w="4392"/>
           </w:tcPr>
           <w:p>
+            <w:r/>
             <w:r>
-              <w:t>DuckDuckGo News</w:t>
+              <w:rPr>
+                <w:b w:val="0"/>
+                <w:sz w:val="22"/>
+              </w:rPr>
+              <w:t>Automatically uses DuckDuckGo News</w:t>
             </w:r>
           </w:p>
         </w:tc>
@@ -1376,21 +2446,31 @@
       <w:tr>
         <w:tc>
           <w:tcPr>
-            <w:tcW w:type="dxa" w:w="4320"/>
+            <w:tcW w:type="dxa" w:w="4392"/>
           </w:tcPr>
           <w:p>
+            <w:r/>
             <w:r>
-              <w:t>DuckDuckGo news empty</w:t>
+              <w:rPr>
+                <w:b w:val="0"/>
+                <w:sz w:val="22"/>
+              </w:rPr>
+              <w:t>DuckDuckGo rate-limited</w:t>
             </w:r>
           </w:p>
         </w:tc>
         <w:tc>
           <w:tcPr>
-            <w:tcW w:type="dxa" w:w="4320"/>
+            <w:tcW w:type="dxa" w:w="4392"/>
           </w:tcPr>
           <w:p>
+            <w:r/>
             <w:r>
-              <w:t>Error message with retry suggestion</w:t>
+              <w:rPr>
+                <w:b w:val="0"/>
+                <w:sz w:val="22"/>
+              </w:rPr>
+              <w:t>Retries 3 times with backoff</w:t>
             </w:r>
           </w:p>
         </w:tc>
@@ -1398,21 +2478,31 @@
       <w:tr>
         <w:tc>
           <w:tcPr>
-            <w:tcW w:type="dxa" w:w="4320"/>
+            <w:tcW w:type="dxa" w:w="4392"/>
           </w:tcPr>
           <w:p>
+            <w:r/>
             <w:r>
-              <w:t>DuckDuckGo search fails</w:t>
+              <w:rPr>
+                <w:b w:val="0"/>
+                <w:sz w:val="22"/>
+              </w:rPr>
+              <w:t>General knowledge question</w:t>
             </w:r>
           </w:p>
         </w:tc>
         <w:tc>
           <w:tcPr>
-            <w:tcW w:type="dxa" w:w="4320"/>
+            <w:tcW w:type="dxa" w:w="4392"/>
           </w:tcPr>
           <w:p>
+            <w:r/>
             <w:r>
-              <w:t>LLM answers from training knowledge</w:t>
+              <w:rPr>
+                <w:b w:val="0"/>
+                <w:sz w:val="22"/>
+              </w:rPr>
+              <w:t>LLM answers from training data (no tool needed)</w:t>
             </w:r>
           </w:p>
         </w:tc>
@@ -1420,21 +2510,31 @@
       <w:tr>
         <w:tc>
           <w:tcPr>
-            <w:tcW w:type="dxa" w:w="4320"/>
+            <w:tcW w:type="dxa" w:w="4392"/>
           </w:tcPr>
           <w:p>
+            <w:r/>
             <w:r>
-              <w:t>JSON parse error in router</w:t>
+              <w:rPr>
+                <w:b w:val="0"/>
+                <w:sz w:val="22"/>
+              </w:rPr>
+              <w:t>Ambiguous city name</w:t>
             </w:r>
           </w:p>
         </w:tc>
         <w:tc>
           <w:tcPr>
-            <w:tcW w:type="dxa" w:w="4320"/>
+            <w:tcW w:type="dxa" w:w="4392"/>
           </w:tcPr>
           <w:p>
+            <w:r/>
             <w:r>
-              <w:t>Defaults to `chat` type</w:t>
+              <w:rPr>
+                <w:b w:val="0"/>
+                <w:sz w:val="22"/>
+              </w:rPr>
+              <w:t>Geocoding picks best match by state/country hint</w:t>
             </w:r>
           </w:p>
         </w:tc>
@@ -1443,25 +2543,55 @@
     <w:p/>
     <w:p/>
     <w:p>
+      <w:pPr>
+        <w:spacing w:before="120"/>
+      </w:pPr>
       <w:r>
-        <w:t>────────────────────────────────────────────────────────────</w:t>
+        <w:rPr>
+          <w:color w:val="CCCCCC"/>
+        </w:rPr>
+        <w:t>─────────────────────────────────────────────────────────────────</w:t>
       </w:r>
     </w:p>
     <w:p/>
     <w:p>
+      <w:pPr>
+        <w:spacing w:before="200" w:after="80"/>
+      </w:pPr>
       <w:r>
         <w:rPr>
           <w:b/>
           <w:color w:val="A23B72"/>
-          <w:sz w:val="32"/>
+          <w:sz w:val="30"/>
         </w:rPr>
         <w:t>Test Cases</w:t>
       </w:r>
     </w:p>
     <w:p/>
     <w:p>
+      <w:pPr>
+        <w:spacing w:after="40"/>
+      </w:pPr>
       <w:r>
-        <w:t>See test_cases.md for full details. Summary:</w:t>
+        <w:rPr>
+          <w:b w:val="0"/>
+          <w:sz w:val="22"/>
+        </w:rPr>
+        <w:t xml:space="preserve">See </w:t>
+      </w:r>
+      <w:r>
+        <w:rPr>
+          <w:b/>
+          <w:sz w:val="22"/>
+        </w:rPr>
+        <w:t>test_cases.md</w:t>
+      </w:r>
+      <w:r>
+        <w:rPr>
+          <w:b w:val="0"/>
+          <w:sz w:val="22"/>
+        </w:rPr>
+        <w:t xml:space="preserve"> for full details. Summary:</w:t>
       </w:r>
     </w:p>
     <w:p/>
@@ -1472,18 +2602,27 @@
         <w:tblLook w:firstColumn="1" w:firstRow="1" w:lastColumn="0" w:lastRow="0" w:noHBand="0" w:noVBand="1" w:val="04A0"/>
       </w:tblPr>
       <w:tblGrid>
-        <w:gridCol w:w="4320"/>
-        <w:gridCol w:w="4320"/>
+        <w:gridCol w:w="4392"/>
+        <w:gridCol w:w="4392"/>
       </w:tblGrid>
       <w:tr>
         <w:tc>
           <w:tcPr>
-            <w:tcW w:type="dxa" w:w="4320"/>
+            <w:tcW w:type="dxa" w:w="4392"/>
+            <w:shd w:val="clear" w:color="auto" w:fill="2E86AB"/>
           </w:tcPr>
           <w:p>
             <w:r>
               <w:rPr>
                 <w:b/>
+                <w:color w:val="FFFFFF"/>
+              </w:rPr>
+            </w:r>
+            <w:r>
+              <w:rPr>
+                <w:b/>
+                <w:color w:val="FFFFFF"/>
+                <w:sz w:val="22"/>
               </w:rPr>
               <w:t>Category</w:t>
             </w:r>
@@ -1491,14 +2630,23 @@
         </w:tc>
         <w:tc>
           <w:tcPr>
-            <w:tcW w:type="dxa" w:w="4320"/>
+            <w:tcW w:type="dxa" w:w="4392"/>
+            <w:shd w:val="clear" w:color="auto" w:fill="2E86AB"/>
           </w:tcPr>
           <w:p>
             <w:r>
               <w:rPr>
                 <w:b/>
+                <w:color w:val="FFFFFF"/>
               </w:rPr>
-              <w:t>Count</w:t>
+            </w:r>
+            <w:r>
+              <w:rPr>
+                <w:b/>
+                <w:color w:val="FFFFFF"/>
+                <w:sz w:val="22"/>
+              </w:rPr>
+              <w:t>Test IDs</w:t>
             </w:r>
           </w:p>
         </w:tc>
@@ -1506,21 +2654,31 @@
       <w:tr>
         <w:tc>
           <w:tcPr>
-            <w:tcW w:type="dxa" w:w="4320"/>
+            <w:tcW w:type="dxa" w:w="4392"/>
           </w:tcPr>
           <w:p>
+            <w:r/>
             <w:r>
-              <w:t>TC-01 to TC-04</w:t>
+              <w:rPr>
+                <w:b w:val="0"/>
+                <w:sz w:val="22"/>
+              </w:rPr>
+              <w:t>News routing (technology, finance, sports, health)</w:t>
             </w:r>
           </w:p>
         </w:tc>
         <w:tc>
           <w:tcPr>
-            <w:tcW w:type="dxa" w:w="4320"/>
+            <w:tcW w:type="dxa" w:w="4392"/>
           </w:tcPr>
           <w:p>
+            <w:r/>
             <w:r>
-              <w:t>News routing — technology, finance, sports, health</w:t>
+              <w:rPr>
+                <w:b w:val="0"/>
+                <w:sz w:val="22"/>
+              </w:rPr>
+              <w:t>TC-01 to TC-04</w:t>
             </w:r>
           </w:p>
         </w:tc>
@@ -1528,21 +2686,31 @@
       <w:tr>
         <w:tc>
           <w:tcPr>
-            <w:tcW w:type="dxa" w:w="4320"/>
+            <w:tcW w:type="dxa" w:w="4392"/>
           </w:tcPr>
           <w:p>
+            <w:r/>
             <w:r>
-              <w:t>TC-05 to TC-07</w:t>
+              <w:rPr>
+                <w:b w:val="0"/>
+                <w:sz w:val="22"/>
+              </w:rPr>
+              <w:t>Web search routing (factual queries)</w:t>
             </w:r>
           </w:p>
         </w:tc>
         <w:tc>
           <w:tcPr>
-            <w:tcW w:type="dxa" w:w="4320"/>
+            <w:tcW w:type="dxa" w:w="4392"/>
           </w:tcPr>
           <w:p>
+            <w:r/>
             <w:r>
-              <w:t>Chat routing — general queries, explanations</w:t>
+              <w:rPr>
+                <w:b w:val="0"/>
+                <w:sz w:val="22"/>
+              </w:rPr>
+              <w:t>TC-05 to TC-07</w:t>
             </w:r>
           </w:p>
         </w:tc>
@@ -1550,21 +2718,31 @@
       <w:tr>
         <w:tc>
           <w:tcPr>
-            <w:tcW w:type="dxa" w:w="4320"/>
+            <w:tcW w:type="dxa" w:w="4392"/>
           </w:tcPr>
           <w:p>
+            <w:r/>
             <w:r>
-              <w:t>TC-08 to TC-09</w:t>
+              <w:rPr>
+                <w:b w:val="0"/>
+                <w:sz w:val="22"/>
+              </w:rPr>
+              <w:t>General chat (LLM answers without tools)</w:t>
             </w:r>
           </w:p>
         </w:tc>
         <w:tc>
           <w:tcPr>
-            <w:tcW w:type="dxa" w:w="4320"/>
+            <w:tcW w:type="dxa" w:w="4392"/>
           </w:tcPr>
           <w:p>
+            <w:r/>
             <w:r>
-              <w:t>Web search routing — live data queries</w:t>
+              <w:rPr>
+                <w:b w:val="0"/>
+                <w:sz w:val="22"/>
+              </w:rPr>
+              <w:t>TC-08 to TC-09</w:t>
             </w:r>
           </w:p>
         </w:tc>
@@ -1572,87 +2750,31 @@
       <w:tr>
         <w:tc>
           <w:tcPr>
-            <w:tcW w:type="dxa" w:w="4320"/>
+            <w:tcW w:type="dxa" w:w="4392"/>
           </w:tcPr>
           <w:p>
+            <w:r/>
             <w:r>
-              <w:t>TC-10 to TC-15</w:t>
+              <w:rPr>
+                <w:b w:val="0"/>
+                <w:sz w:val="22"/>
+              </w:rPr>
+              <w:t>Multi-turn memory</w:t>
             </w:r>
           </w:p>
         </w:tc>
         <w:tc>
           <w:tcPr>
-            <w:tcW w:type="dxa" w:w="4320"/>
+            <w:tcW w:type="dxa" w:w="4392"/>
           </w:tcPr>
           <w:p>
+            <w:r/>
             <w:r>
-              <w:t>Fallback &amp; error handling</w:t>
-            </w:r>
-          </w:p>
-        </w:tc>
-      </w:tr>
-      <w:tr>
-        <w:tc>
-          <w:tcPr>
-            <w:tcW w:type="dxa" w:w="4320"/>
-          </w:tcPr>
-          <w:p>
-            <w:r>
-              <w:t>TC-16 to TC-20</w:t>
-            </w:r>
-          </w:p>
-        </w:tc>
-        <w:tc>
-          <w:tcPr>
-            <w:tcW w:type="dxa" w:w="4320"/>
-          </w:tcPr>
-          <w:p>
-            <w:r>
-              <w:t>Multi-turn memory validation</w:t>
-            </w:r>
-          </w:p>
-        </w:tc>
-      </w:tr>
-      <w:tr>
-        <w:tc>
-          <w:tcPr>
-            <w:tcW w:type="dxa" w:w="4320"/>
-          </w:tcPr>
-          <w:p>
-            <w:r>
-              <w:t>TC-21 to TC-25</w:t>
-            </w:r>
-          </w:p>
-        </w:tc>
-        <w:tc>
-          <w:tcPr>
-            <w:tcW w:type="dxa" w:w="4320"/>
-          </w:tcPr>
-          <w:p>
-            <w:r>
-              <w:t>Edge cases — empty queries, ambiguous input</w:t>
-            </w:r>
-          </w:p>
-        </w:tc>
-      </w:tr>
-      <w:tr>
-        <w:tc>
-          <w:tcPr>
-            <w:tcW w:type="dxa" w:w="4320"/>
-          </w:tcPr>
-          <w:p>
-            <w:r>
-              <w:t>TC-26 to TC-30</w:t>
-            </w:r>
-          </w:p>
-        </w:tc>
-        <w:tc>
-          <w:tcPr>
-            <w:tcW w:type="dxa" w:w="4320"/>
-          </w:tcPr>
-          <w:p>
-            <w:r>
-              <w:t>Streamlit UI interaction tests</w:t>
+              <w:rPr>
+                <w:b w:val="0"/>
+                <w:sz w:val="22"/>
+              </w:rPr>
+              <w:t>TC-10</w:t>
             </w:r>
           </w:p>
         </w:tc>
@@ -1661,23 +2783,46 @@
     <w:p/>
     <w:p/>
     <w:p>
+      <w:pPr>
+        <w:spacing w:after="40"/>
+      </w:pPr>
       <w:r>
-        <w:t>Pass criteria: ≥ 80% PASS across all test cases.</w:t>
+        <w:rPr>
+          <w:b/>
+          <w:sz w:val="22"/>
+        </w:rPr>
+        <w:t>Pass criteria:</w:t>
+      </w:r>
+      <w:r>
+        <w:rPr>
+          <w:b w:val="0"/>
+          <w:sz w:val="22"/>
+        </w:rPr>
+        <w:t xml:space="preserve"> ≥ 80% PASS across all test cases.</w:t>
       </w:r>
     </w:p>
     <w:p/>
     <w:p>
+      <w:pPr>
+        <w:spacing w:before="120"/>
+      </w:pPr>
       <w:r>
-        <w:t>────────────────────────────────────────────────────────────</w:t>
+        <w:rPr>
+          <w:color w:val="CCCCCC"/>
+        </w:rPr>
+        <w:t>─────────────────────────────────────────────────────────────────</w:t>
       </w:r>
     </w:p>
     <w:p/>
     <w:p>
+      <w:pPr>
+        <w:spacing w:before="200" w:after="80"/>
+      </w:pPr>
       <w:r>
         <w:rPr>
           <w:b/>
           <w:color w:val="A23B72"/>
-          <w:sz w:val="32"/>
+          <w:sz w:val="30"/>
         </w:rPr>
         <w:t>Key Libraries</w:t>
       </w:r>
@@ -1690,18 +2835,27 @@
         <w:tblLook w:firstColumn="1" w:firstRow="1" w:lastColumn="0" w:lastRow="0" w:noHBand="0" w:noVBand="1" w:val="04A0"/>
       </w:tblPr>
       <w:tblGrid>
-        <w:gridCol w:w="4320"/>
-        <w:gridCol w:w="4320"/>
+        <w:gridCol w:w="4392"/>
+        <w:gridCol w:w="4392"/>
       </w:tblGrid>
       <w:tr>
         <w:tc>
           <w:tcPr>
-            <w:tcW w:type="dxa" w:w="4320"/>
+            <w:tcW w:type="dxa" w:w="4392"/>
+            <w:shd w:val="clear" w:color="auto" w:fill="2E86AB"/>
           </w:tcPr>
           <w:p>
             <w:r>
               <w:rPr>
                 <w:b/>
+                <w:color w:val="FFFFFF"/>
+              </w:rPr>
+            </w:r>
+            <w:r>
+              <w:rPr>
+                <w:b/>
+                <w:color w:val="FFFFFF"/>
+                <w:sz w:val="22"/>
               </w:rPr>
               <w:t>Library</w:t>
             </w:r>
@@ -1709,12 +2863,21 @@
         </w:tc>
         <w:tc>
           <w:tcPr>
-            <w:tcW w:type="dxa" w:w="4320"/>
+            <w:tcW w:type="dxa" w:w="4392"/>
+            <w:shd w:val="clear" w:color="auto" w:fill="2E86AB"/>
           </w:tcPr>
           <w:p>
             <w:r>
               <w:rPr>
                 <w:b/>
+                <w:color w:val="FFFFFF"/>
+              </w:rPr>
+            </w:r>
+            <w:r>
+              <w:rPr>
+                <w:b/>
+                <w:color w:val="FFFFFF"/>
+                <w:sz w:val="22"/>
               </w:rPr>
               <w:t>Purpose</w:t>
             </w:r>
@@ -1724,21 +2887,31 @@
       <w:tr>
         <w:tc>
           <w:tcPr>
-            <w:tcW w:type="dxa" w:w="4320"/>
+            <w:tcW w:type="dxa" w:w="4392"/>
           </w:tcPr>
           <w:p>
+            <w:r/>
             <w:r>
+              <w:rPr>
+                <w:b w:val="0"/>
+                <w:sz w:val="22"/>
+              </w:rPr>
               <w:t>`langgraph`</w:t>
             </w:r>
           </w:p>
         </w:tc>
         <w:tc>
           <w:tcPr>
-            <w:tcW w:type="dxa" w:w="4320"/>
+            <w:tcW w:type="dxa" w:w="4392"/>
           </w:tcPr>
           <w:p>
+            <w:r/>
             <w:r>
-              <w:t>`StateGraph` workflow — nodes, conditional routing, memory</w:t>
+              <w:rPr>
+                <w:b w:val="0"/>
+                <w:sz w:val="22"/>
+              </w:rPr>
+              <w:t>`create_react_agent` — ReAct agentic loop with `MemorySaver`</w:t>
             </w:r>
           </w:p>
         </w:tc>
@@ -1746,21 +2919,31 @@
       <w:tr>
         <w:tc>
           <w:tcPr>
-            <w:tcW w:type="dxa" w:w="4320"/>
+            <w:tcW w:type="dxa" w:w="4392"/>
           </w:tcPr>
           <w:p>
+            <w:r/>
             <w:r>
+              <w:rPr>
+                <w:b w:val="0"/>
+                <w:sz w:val="22"/>
+              </w:rPr>
               <w:t>`langchain-openai`</w:t>
             </w:r>
           </w:p>
         </w:tc>
         <w:tc>
           <w:tcPr>
-            <w:tcW w:type="dxa" w:w="4320"/>
+            <w:tcW w:type="dxa" w:w="4392"/>
           </w:tcPr>
           <w:p>
+            <w:r/>
             <w:r>
-              <w:t>GPT-4o-mini LLM for routing, chat, and synthesis</w:t>
+              <w:rPr>
+                <w:b w:val="0"/>
+                <w:sz w:val="22"/>
+              </w:rPr>
+              <w:t>GPT-4o-mini LLM for reasoning and synthesis</w:t>
             </w:r>
           </w:p>
         </w:tc>
@@ -1768,21 +2951,31 @@
       <w:tr>
         <w:tc>
           <w:tcPr>
-            <w:tcW w:type="dxa" w:w="4320"/>
+            <w:tcW w:type="dxa" w:w="4392"/>
           </w:tcPr>
           <w:p>
+            <w:r/>
             <w:r>
-              <w:t>`duckduckgo-search`</w:t>
+              <w:rPr>
+                <w:b w:val="0"/>
+                <w:sz w:val="22"/>
+              </w:rPr>
+              <w:t>`langchain-core`</w:t>
             </w:r>
           </w:p>
         </w:tc>
         <w:tc>
           <w:tcPr>
-            <w:tcW w:type="dxa" w:w="4320"/>
+            <w:tcW w:type="dxa" w:w="4392"/>
           </w:tcPr>
           <w:p>
+            <w:r/>
             <w:r>
-              <w:t>No-key news and web search fallback</w:t>
+              <w:rPr>
+                <w:b w:val="0"/>
+                <w:sz w:val="22"/>
+              </w:rPr>
+              <w:t>`@tool` decorator for defining agent tools</w:t>
             </w:r>
           </w:p>
         </w:tc>
@@ -1790,21 +2983,31 @@
       <w:tr>
         <w:tc>
           <w:tcPr>
-            <w:tcW w:type="dxa" w:w="4320"/>
+            <w:tcW w:type="dxa" w:w="4392"/>
           </w:tcPr>
           <w:p>
+            <w:r/>
             <w:r>
-              <w:t>`newsapi-python`</w:t>
+              <w:rPr>
+                <w:b w:val="0"/>
+                <w:sz w:val="22"/>
+              </w:rPr>
+              <w:t>`ddgs`</w:t>
             </w:r>
           </w:p>
         </w:tc>
         <w:tc>
           <w:tcPr>
-            <w:tcW w:type="dxa" w:w="4320"/>
+            <w:tcW w:type="dxa" w:w="4392"/>
           </w:tcPr>
           <w:p>
+            <w:r/>
             <w:r>
-              <w:t>Real-time news headlines by category</w:t>
+              <w:rPr>
+                <w:b w:val="0"/>
+                <w:sz w:val="22"/>
+              </w:rPr>
+              <w:t>DuckDuckGo news and web search (no API key)</w:t>
             </w:r>
           </w:p>
         </w:tc>
@@ -1812,21 +3015,31 @@
       <w:tr>
         <w:tc>
           <w:tcPr>
-            <w:tcW w:type="dxa" w:w="4320"/>
+            <w:tcW w:type="dxa" w:w="4392"/>
           </w:tcPr>
           <w:p>
+            <w:r/>
             <w:r>
-              <w:t>`streamlit`</w:t>
+              <w:rPr>
+                <w:b w:val="0"/>
+                <w:sz w:val="22"/>
+              </w:rPr>
+              <w:t>`requests`</w:t>
             </w:r>
           </w:p>
         </w:tc>
         <w:tc>
           <w:tcPr>
-            <w:tcW w:type="dxa" w:w="4320"/>
+            <w:tcW w:type="dxa" w:w="4392"/>
           </w:tcPr>
           <w:p>
+            <w:r/>
             <w:r>
-              <w:t>Interactive web UI</w:t>
+              <w:rPr>
+                <w:b w:val="0"/>
+                <w:sz w:val="22"/>
+              </w:rPr>
+              <w:t>NewsAPI and Open-Meteo HTTP calls</w:t>
             </w:r>
           </w:p>
         </w:tc>
@@ -1834,21 +3047,31 @@
       <w:tr>
         <w:tc>
           <w:tcPr>
-            <w:tcW w:type="dxa" w:w="4320"/>
+            <w:tcW w:type="dxa" w:w="4392"/>
           </w:tcPr>
           <w:p>
+            <w:r/>
             <w:r>
-              <w:t>`python-dotenv`</w:t>
+              <w:rPr>
+                <w:b w:val="0"/>
+                <w:sz w:val="22"/>
+              </w:rPr>
+              <w:t>`streamlit`</w:t>
             </w:r>
           </w:p>
         </w:tc>
         <w:tc>
           <w:tcPr>
-            <w:tcW w:type="dxa" w:w="4320"/>
+            <w:tcW w:type="dxa" w:w="4392"/>
           </w:tcPr>
           <w:p>
+            <w:r/>
             <w:r>
-              <w:t>API key management</w:t>
+              <w:rPr>
+                <w:b w:val="0"/>
+                <w:sz w:val="22"/>
+              </w:rPr>
+              <w:t>Interactive multi-page web UI</w:t>
             </w:r>
           </w:p>
         </w:tc>
@@ -1856,20 +3079,62 @@
       <w:tr>
         <w:tc>
           <w:tcPr>
-            <w:tcW w:type="dxa" w:w="4320"/>
+            <w:tcW w:type="dxa" w:w="4392"/>
           </w:tcPr>
           <w:p>
+            <w:r/>
             <w:r>
+              <w:rPr>
+                <w:b w:val="0"/>
+                <w:sz w:val="22"/>
+              </w:rPr>
+              <w:t>`python-dotenv`</w:t>
+            </w:r>
+          </w:p>
+        </w:tc>
+        <w:tc>
+          <w:tcPr>
+            <w:tcW w:type="dxa" w:w="4392"/>
+          </w:tcPr>
+          <w:p>
+            <w:r/>
+            <w:r>
+              <w:rPr>
+                <w:b w:val="0"/>
+                <w:sz w:val="22"/>
+              </w:rPr>
+              <w:t>API key management via `.env`</w:t>
+            </w:r>
+          </w:p>
+        </w:tc>
+      </w:tr>
+      <w:tr>
+        <w:tc>
+          <w:tcPr>
+            <w:tcW w:type="dxa" w:w="4392"/>
+          </w:tcPr>
+          <w:p>
+            <w:r/>
+            <w:r>
+              <w:rPr>
+                <w:b w:val="0"/>
+                <w:sz w:val="22"/>
+              </w:rPr>
               <w:t>`python-docx`</w:t>
             </w:r>
           </w:p>
         </w:tc>
         <w:tc>
           <w:tcPr>
-            <w:tcW w:type="dxa" w:w="4320"/>
+            <w:tcW w:type="dxa" w:w="4392"/>
           </w:tcPr>
           <w:p>
+            <w:r/>
             <w:r>
+              <w:rPr>
+                <w:b w:val="0"/>
+                <w:sz w:val="22"/>
+              </w:rPr>
               <w:t>README Word document generation</w:t>
             </w:r>
           </w:p>
@@ -1879,17 +3144,26 @@
     <w:p/>
     <w:p/>
     <w:p>
+      <w:pPr>
+        <w:spacing w:before="120"/>
+      </w:pPr>
       <w:r>
-        <w:t>────────────────────────────────────────────────────────────</w:t>
+        <w:rPr>
+          <w:color w:val="CCCCCC"/>
+        </w:rPr>
+        <w:t>─────────────────────────────────────────────────────────────────</w:t>
       </w:r>
     </w:p>
     <w:p/>
     <w:p>
+      <w:pPr>
+        <w:spacing w:before="200" w:after="80"/>
+      </w:pPr>
       <w:r>
         <w:rPr>
           <w:b/>
           <w:color w:val="A23B72"/>
-          <w:sz w:val="32"/>
+          <w:sz w:val="30"/>
         </w:rPr>
         <w:t>CEP Requirements Coverage</w:t>
       </w:r>
@@ -1902,18 +3176,27 @@
         <w:tblLook w:firstColumn="1" w:firstRow="1" w:lastColumn="0" w:lastRow="0" w:noHBand="0" w:noVBand="1" w:val="04A0"/>
       </w:tblPr>
       <w:tblGrid>
-        <w:gridCol w:w="4320"/>
-        <w:gridCol w:w="4320"/>
+        <w:gridCol w:w="4392"/>
+        <w:gridCol w:w="4392"/>
       </w:tblGrid>
       <w:tr>
         <w:tc>
           <w:tcPr>
-            <w:tcW w:type="dxa" w:w="4320"/>
+            <w:tcW w:type="dxa" w:w="4392"/>
+            <w:shd w:val="clear" w:color="auto" w:fill="2E86AB"/>
           </w:tcPr>
           <w:p>
             <w:r>
               <w:rPr>
                 <w:b/>
+                <w:color w:val="FFFFFF"/>
+              </w:rPr>
+            </w:r>
+            <w:r>
+              <w:rPr>
+                <w:b/>
+                <w:color w:val="FFFFFF"/>
+                <w:sz w:val="22"/>
               </w:rPr>
               <w:t>Requirement</w:t>
             </w:r>
@@ -1921,12 +3204,21 @@
         </w:tc>
         <w:tc>
           <w:tcPr>
-            <w:tcW w:type="dxa" w:w="4320"/>
+            <w:tcW w:type="dxa" w:w="4392"/>
+            <w:shd w:val="clear" w:color="auto" w:fill="2E86AB"/>
           </w:tcPr>
           <w:p>
             <w:r>
               <w:rPr>
                 <w:b/>
+                <w:color w:val="FFFFFF"/>
+              </w:rPr>
+            </w:r>
+            <w:r>
+              <w:rPr>
+                <w:b/>
+                <w:color w:val="FFFFFF"/>
+                <w:sz w:val="22"/>
               </w:rPr>
               <w:t>Implementation</w:t>
             </w:r>
@@ -1936,21 +3228,31 @@
       <w:tr>
         <w:tc>
           <w:tcPr>
-            <w:tcW w:type="dxa" w:w="4320"/>
+            <w:tcW w:type="dxa" w:w="4392"/>
           </w:tcPr>
           <w:p>
+            <w:r/>
             <w:r>
-              <w:t>AI chatbot — conversation management</w:t>
+              <w:rPr>
+                <w:b w:val="0"/>
+                <w:sz w:val="22"/>
+              </w:rPr>
+              <w:t>Agentic AI with tool use</w:t>
             </w:r>
           </w:p>
         </w:tc>
         <w:tc>
           <w:tcPr>
-            <w:tcW w:type="dxa" w:w="4320"/>
+            <w:tcW w:type="dxa" w:w="4392"/>
           </w:tcPr>
           <w:p>
+            <w:r/>
             <w:r>
-              <w:t>GPT-4o-mini Chat Node with `MemorySaver` history</w:t>
+              <w:rPr>
+                <w:b w:val="0"/>
+                <w:sz w:val="22"/>
+              </w:rPr>
+              <w:t>`create_react_agent` — LLM autonomously selects and calls tools</w:t>
             </w:r>
           </w:p>
         </w:tc>
@@ -1958,42 +3260,30 @@
       <w:tr>
         <w:tc>
           <w:tcPr>
-            <w:tcW w:type="dxa" w:w="4320"/>
+            <w:tcW w:type="dxa" w:w="4392"/>
           </w:tcPr>
           <w:p>
+            <w:r/>
             <w:r>
-              <w:t>Query differentiation</w:t>
-            </w:r>
-          </w:p>
-        </w:tc>
-        <w:tc>
-          <w:tcPr>
-            <w:tcW w:type="dxa" w:w="4320"/>
-          </w:tcPr>
-          <w:p>
-            <w:r>
-              <w:t>LangGraph Router Node — `news` / `search` / `chat`</w:t>
-            </w:r>
-          </w:p>
-        </w:tc>
-      </w:tr>
-      <w:tr>
-        <w:tc>
-          <w:tcPr>
-            <w:tcW w:type="dxa" w:w="4320"/>
-          </w:tcPr>
-          <w:p>
-            <w:r>
+              <w:rPr>
+                <w:b w:val="0"/>
+                <w:sz w:val="22"/>
+              </w:rPr>
               <w:t>Real-time news API integration</w:t>
             </w:r>
           </w:p>
         </w:tc>
         <w:tc>
           <w:tcPr>
-            <w:tcW w:type="dxa" w:w="4320"/>
+            <w:tcW w:type="dxa" w:w="4392"/>
           </w:tcPr>
           <w:p>
+            <w:r/>
             <w:r>
+              <w:rPr>
+                <w:b w:val="0"/>
+                <w:sz w:val="22"/>
+              </w:rPr>
               <w:t>NewsAPI.org + DuckDuckGo fallback</w:t>
             </w:r>
           </w:p>
@@ -2002,21 +3292,31 @@
       <w:tr>
         <w:tc>
           <w:tcPr>
-            <w:tcW w:type="dxa" w:w="4320"/>
+            <w:tcW w:type="dxa" w:w="4392"/>
           </w:tcPr>
           <w:p>
+            <w:r/>
             <w:r>
-              <w:t>Technology, finance, sports categories</w:t>
+              <w:rPr>
+                <w:b w:val="0"/>
+                <w:sz w:val="22"/>
+              </w:rPr>
+              <w:t>Technology, finance, sports, health, science categories</w:t>
             </w:r>
           </w:p>
         </w:tc>
         <w:tc>
           <w:tcPr>
-            <w:tcW w:type="dxa" w:w="4320"/>
+            <w:tcW w:type="dxa" w:w="4392"/>
           </w:tcPr>
           <w:p>
+            <w:r/>
             <w:r>
-              <w:t>All 6 categories supported</w:t>
+              <w:rPr>
+                <w:b w:val="0"/>
+                <w:sz w:val="22"/>
+              </w:rPr>
+              <w:t>All 7 categories supported</w:t>
             </w:r>
           </w:p>
         </w:tc>
@@ -2024,21 +3324,31 @@
       <w:tr>
         <w:tc>
           <w:tcPr>
-            <w:tcW w:type="dxa" w:w="4320"/>
+            <w:tcW w:type="dxa" w:w="4392"/>
           </w:tcPr>
           <w:p>
+            <w:r/>
             <w:r>
+              <w:rPr>
+                <w:b w:val="0"/>
+                <w:sz w:val="22"/>
+              </w:rPr>
               <w:t>Web search tool</w:t>
             </w:r>
           </w:p>
         </w:tc>
         <w:tc>
           <w:tcPr>
-            <w:tcW w:type="dxa" w:w="4320"/>
+            <w:tcW w:type="dxa" w:w="4392"/>
           </w:tcPr>
           <w:p>
+            <w:r/>
             <w:r>
-              <w:t>DuckDuckGo text search + LLM synthesis</w:t>
+              <w:rPr>
+                <w:b w:val="0"/>
+                <w:sz w:val="22"/>
+              </w:rPr>
+              <w:t>`search_web` tool via DuckDuckGo</w:t>
             </w:r>
           </w:p>
         </w:tc>
@@ -2046,21 +3356,31 @@
       <w:tr>
         <w:tc>
           <w:tcPr>
-            <w:tcW w:type="dxa" w:w="4320"/>
+            <w:tcW w:type="dxa" w:w="4392"/>
           </w:tcPr>
           <w:p>
+            <w:r/>
             <w:r>
-              <w:t>LangGraph-based workflow</w:t>
+              <w:rPr>
+                <w:b w:val="0"/>
+                <w:sz w:val="22"/>
+              </w:rPr>
+              <w:t>Weather integration</w:t>
             </w:r>
           </w:p>
         </w:tc>
         <w:tc>
           <w:tcPr>
-            <w:tcW w:type="dxa" w:w="4320"/>
+            <w:tcW w:type="dxa" w:w="4392"/>
           </w:tcPr>
           <w:p>
+            <w:r/>
             <w:r>
-              <w:t>Full `StateGraph` with 5 nodes</w:t>
+              <w:rPr>
+                <w:b w:val="0"/>
+                <w:sz w:val="22"/>
+              </w:rPr>
+              <w:t>`get_weather` tool via Open-Meteo (no key needed)</w:t>
             </w:r>
           </w:p>
         </w:tc>
@@ -2068,21 +3388,31 @@
       <w:tr>
         <w:tc>
           <w:tcPr>
-            <w:tcW w:type="dxa" w:w="4320"/>
+            <w:tcW w:type="dxa" w:w="4392"/>
           </w:tcPr>
           <w:p>
+            <w:r/>
             <w:r>
-              <w:t>Fallback mechanisms</w:t>
+              <w:rPr>
+                <w:b w:val="0"/>
+                <w:sz w:val="22"/>
+              </w:rPr>
+              <w:t>Multi-turn conversation memory</w:t>
             </w:r>
           </w:p>
         </w:tc>
         <w:tc>
           <w:tcPr>
-            <w:tcW w:type="dxa" w:w="4320"/>
+            <w:tcW w:type="dxa" w:w="4392"/>
           </w:tcPr>
           <w:p>
+            <w:r/>
             <w:r>
-              <w:t>3-tier fallback chain for each failure mode</w:t>
+              <w:rPr>
+                <w:b w:val="0"/>
+                <w:sz w:val="22"/>
+              </w:rPr>
+              <w:t>`MemorySaver` checkpointer across all turns</w:t>
             </w:r>
           </w:p>
         </w:tc>
@@ -2090,21 +3420,31 @@
       <w:tr>
         <w:tc>
           <w:tcPr>
-            <w:tcW w:type="dxa" w:w="4320"/>
+            <w:tcW w:type="dxa" w:w="4392"/>
           </w:tcPr>
           <w:p>
+            <w:r/>
             <w:r>
-              <w:t>Streamlit UI with session management</w:t>
+              <w:rPr>
+                <w:b w:val="0"/>
+                <w:sz w:val="22"/>
+              </w:rPr>
+              <w:t>LangGraph-based workflow</w:t>
             </w:r>
           </w:p>
         </w:tc>
         <w:tc>
           <w:tcPr>
-            <w:tcW w:type="dxa" w:w="4320"/>
+            <w:tcW w:type="dxa" w:w="4392"/>
           </w:tcPr>
           <w:p>
+            <w:r/>
             <w:r>
-              <w:t>3-page Streamlit app with `MemorySaver`</w:t>
+              <w:rPr>
+                <w:b w:val="0"/>
+                <w:sz w:val="22"/>
+              </w:rPr>
+              <w:t>`create_react_agent` built on LangGraph internals</w:t>
             </w:r>
           </w:p>
         </w:tc>
@@ -2112,21 +3452,31 @@
       <w:tr>
         <w:tc>
           <w:tcPr>
-            <w:tcW w:type="dxa" w:w="4320"/>
+            <w:tcW w:type="dxa" w:w="4392"/>
           </w:tcPr>
           <w:p>
+            <w:r/>
             <w:r>
-              <w:t>Error handling</w:t>
+              <w:rPr>
+                <w:b w:val="0"/>
+                <w:sz w:val="22"/>
+              </w:rPr>
+              <w:t>Fallback mechanisms</w:t>
             </w:r>
           </w:p>
         </w:tc>
         <w:tc>
           <w:tcPr>
-            <w:tcW w:type="dxa" w:w="4320"/>
+            <w:tcW w:type="dxa" w:w="4392"/>
           </w:tcPr>
           <w:p>
+            <w:r/>
             <w:r>
-              <w:t>Missing keys, failed APIs, empty results</w:t>
+              <w:rPr>
+                <w:b w:val="0"/>
+                <w:sz w:val="22"/>
+              </w:rPr>
+              <w:t>DuckDuckGo fallback + rate-limit retry + direct LLM fallback</w:t>
             </w:r>
           </w:p>
         </w:tc>
@@ -2134,21 +3484,95 @@
       <w:tr>
         <w:tc>
           <w:tcPr>
-            <w:tcW w:type="dxa" w:w="4320"/>
+            <w:tcW w:type="dxa" w:w="4392"/>
           </w:tcPr>
           <w:p>
+            <w:r/>
             <w:r>
-              <w:t>Workflow and error handling documentation</w:t>
+              <w:rPr>
+                <w:b w:val="0"/>
+                <w:sz w:val="22"/>
+              </w:rPr>
+              <w:t>Streamlit UI with session management</w:t>
             </w:r>
           </w:p>
         </w:tc>
         <w:tc>
           <w:tcPr>
-            <w:tcW w:type="dxa" w:w="4320"/>
+            <w:tcW w:type="dxa" w:w="4392"/>
           </w:tcPr>
           <w:p>
+            <w:r/>
             <w:r>
-              <w:t>`test_cases.md` + notebook Step 7</w:t>
+              <w:rPr>
+                <w:b w:val="0"/>
+                <w:sz w:val="22"/>
+              </w:rPr>
+              <w:t>3-page app with persistent session state</w:t>
+            </w:r>
+          </w:p>
+        </w:tc>
+      </w:tr>
+      <w:tr>
+        <w:tc>
+          <w:tcPr>
+            <w:tcW w:type="dxa" w:w="4392"/>
+          </w:tcPr>
+          <w:p>
+            <w:r/>
+            <w:r>
+              <w:rPr>
+                <w:b w:val="0"/>
+                <w:sz w:val="22"/>
+              </w:rPr>
+              <w:t>Automated test cases</w:t>
+            </w:r>
+          </w:p>
+        </w:tc>
+        <w:tc>
+          <w:tcPr>
+            <w:tcW w:type="dxa" w:w="4392"/>
+          </w:tcPr>
+          <w:p>
+            <w:r/>
+            <w:r>
+              <w:rPr>
+                <w:b w:val="0"/>
+                <w:sz w:val="22"/>
+              </w:rPr>
+              <w:t>10 tests validating tool selection and response quality</w:t>
+            </w:r>
+          </w:p>
+        </w:tc>
+      </w:tr>
+      <w:tr>
+        <w:tc>
+          <w:tcPr>
+            <w:tcW w:type="dxa" w:w="4392"/>
+          </w:tcPr>
+          <w:p>
+            <w:r/>
+            <w:r>
+              <w:rPr>
+                <w:b w:val="0"/>
+                <w:sz w:val="22"/>
+              </w:rPr>
+              <w:t>Multi-file architecture</w:t>
+            </w:r>
+          </w:p>
+        </w:tc>
+        <w:tc>
+          <w:tcPr>
+            <w:tcW w:type="dxa" w:w="4392"/>
+          </w:tcPr>
+          <w:p>
+            <w:r/>
+            <w:r>
+              <w:rPr>
+                <w:b w:val="0"/>
+                <w:sz w:val="22"/>
+              </w:rPr>
+              <w:t>`tools.py` → `agents.py` → `workflow.py` → `streamlit_app.py`</w:t>
             </w:r>
           </w:p>
         </w:tc>
@@ -2157,7 +3581,7 @@
     <w:p/>
     <w:sectPr>
       <w:pgSz w:w="12240" w:h="15840"/>
-      <w:pgMar w:top="1440" w:right="1800" w:bottom="1440" w:left="1800" w:header="720" w:footer="720" w:gutter="0"/>
+      <w:pgMar w:top="1440" w:right="1728" w:bottom="1440" w:left="1728" w:header="720" w:footer="720" w:gutter="0"/>
       <w:cols w:space="720"/>
       <w:docGrid w:linePitch="360"/>
     </w:sectPr>

</xml_diff>

<commit_message>
Add content reliability filter — filter misleading/unreliable articles
Implements the CEP requirement: "Filter out unreliable or misleading content"

- TRUSTED_SOURCES: 50+ major outlets (Reuters, BBC, Bloomberg, ESPN, etc.)
- FLAGGED_SOURCES: known misinformation domains — removed entirely
- CLICKBAIT_PATTERNS: regex rules for sensational titles, dropped if matched
- _reliability_score(): scores each article as trusted / unverified / flagged
- _filter_and_score(): applies filter and annotates remaining articles with
  ✅ Trusted Source / ❓ Unverified Source badges shown in results
- Applied to both get_top_headlines and search_news tools
- README updated with Content Reliability Filter section; README.docx regenerated

Co-Authored-By: Claude Sonnet 4.6 <noreply@anthropic.com>
</commit_message>
<xml_diff>
--- a/README.docx
+++ b/README.docx
@@ -2351,6 +2351,376 @@
           <w:color w:val="A23B72"/>
           <w:sz w:val="30"/>
         </w:rPr>
+        <w:t>Content Reliability Filter</w:t>
+      </w:r>
+    </w:p>
+    <w:p/>
+    <w:p>
+      <w:pPr>
+        <w:spacing w:after="40"/>
+      </w:pPr>
+      <w:r>
+        <w:rPr>
+          <w:b w:val="0"/>
+          <w:sz w:val="22"/>
+        </w:rPr>
+        <w:t>A key requirement of NewsGenie is filtering out unreliable or misleading content. Every article passes through a reliability scoring layer before being shown to the user.</w:t>
+      </w:r>
+    </w:p>
+    <w:p/>
+    <w:tbl>
+      <w:tblPr>
+        <w:tblStyle w:val="TableGrid"/>
+        <w:tblW w:type="auto" w:w="0"/>
+        <w:tblLook w:firstColumn="1" w:firstRow="1" w:lastColumn="0" w:lastRow="0" w:noHBand="0" w:noVBand="1" w:val="04A0"/>
+      </w:tblPr>
+      <w:tblGrid>
+        <w:gridCol w:w="2928"/>
+        <w:gridCol w:w="2928"/>
+        <w:gridCol w:w="2928"/>
+      </w:tblGrid>
+      <w:tr>
+        <w:tc>
+          <w:tcPr>
+            <w:tcW w:type="dxa" w:w="2928"/>
+            <w:shd w:val="clear" w:color="auto" w:fill="2E86AB"/>
+          </w:tcPr>
+          <w:p>
+            <w:r>
+              <w:rPr>
+                <w:b/>
+                <w:color w:val="FFFFFF"/>
+              </w:rPr>
+            </w:r>
+            <w:r>
+              <w:rPr>
+                <w:b/>
+                <w:color w:val="FFFFFF"/>
+                <w:sz w:val="22"/>
+              </w:rPr>
+              <w:t>Score</w:t>
+            </w:r>
+          </w:p>
+        </w:tc>
+        <w:tc>
+          <w:tcPr>
+            <w:tcW w:type="dxa" w:w="2928"/>
+            <w:shd w:val="clear" w:color="auto" w:fill="2E86AB"/>
+          </w:tcPr>
+          <w:p>
+            <w:r>
+              <w:rPr>
+                <w:b/>
+                <w:color w:val="FFFFFF"/>
+              </w:rPr>
+            </w:r>
+            <w:r>
+              <w:rPr>
+                <w:b/>
+                <w:color w:val="FFFFFF"/>
+                <w:sz w:val="22"/>
+              </w:rPr>
+              <w:t>Badge</w:t>
+            </w:r>
+          </w:p>
+        </w:tc>
+        <w:tc>
+          <w:tcPr>
+            <w:tcW w:type="dxa" w:w="2928"/>
+            <w:shd w:val="clear" w:color="auto" w:fill="2E86AB"/>
+          </w:tcPr>
+          <w:p>
+            <w:r>
+              <w:rPr>
+                <w:b/>
+                <w:color w:val="FFFFFF"/>
+              </w:rPr>
+            </w:r>
+            <w:r>
+              <w:rPr>
+                <w:b/>
+                <w:color w:val="FFFFFF"/>
+                <w:sz w:val="22"/>
+              </w:rPr>
+              <w:t>Criteria</w:t>
+            </w:r>
+          </w:p>
+        </w:tc>
+      </w:tr>
+      <w:tr>
+        <w:tc>
+          <w:tcPr>
+            <w:tcW w:type="dxa" w:w="2928"/>
+          </w:tcPr>
+          <w:p>
+            <w:r/>
+            <w:r>
+              <w:rPr>
+                <w:b w:val="0"/>
+                <w:sz w:val="22"/>
+              </w:rPr>
+              <w:t>Trusted</w:t>
+            </w:r>
+          </w:p>
+        </w:tc>
+        <w:tc>
+          <w:tcPr>
+            <w:tcW w:type="dxa" w:w="2928"/>
+          </w:tcPr>
+          <w:p>
+            <w:r/>
+            <w:r>
+              <w:rPr>
+                <w:b w:val="0"/>
+                <w:sz w:val="22"/>
+              </w:rPr>
+              <w:t>✅ Trusted Source</w:t>
+            </w:r>
+          </w:p>
+        </w:tc>
+        <w:tc>
+          <w:tcPr>
+            <w:tcW w:type="dxa" w:w="2928"/>
+          </w:tcPr>
+          <w:p>
+            <w:r/>
+            <w:r>
+              <w:rPr>
+                <w:b w:val="0"/>
+                <w:sz w:val="22"/>
+              </w:rPr>
+              <w:t>Article from a known reputable outlet (Reuters, BBC, Bloomberg, ESPN, etc.)</w:t>
+            </w:r>
+          </w:p>
+        </w:tc>
+      </w:tr>
+      <w:tr>
+        <w:tc>
+          <w:tcPr>
+            <w:tcW w:type="dxa" w:w="2928"/>
+          </w:tcPr>
+          <w:p>
+            <w:r/>
+            <w:r>
+              <w:rPr>
+                <w:b w:val="0"/>
+                <w:sz w:val="22"/>
+              </w:rPr>
+              <w:t>Unverified</w:t>
+            </w:r>
+          </w:p>
+        </w:tc>
+        <w:tc>
+          <w:tcPr>
+            <w:tcW w:type="dxa" w:w="2928"/>
+          </w:tcPr>
+          <w:p>
+            <w:r/>
+            <w:r>
+              <w:rPr>
+                <w:b w:val="0"/>
+                <w:sz w:val="22"/>
+              </w:rPr>
+              <w:t>❓ Unverified Source</w:t>
+            </w:r>
+          </w:p>
+        </w:tc>
+        <w:tc>
+          <w:tcPr>
+            <w:tcW w:type="dxa" w:w="2928"/>
+          </w:tcPr>
+          <w:p>
+            <w:r/>
+            <w:r>
+              <w:rPr>
+                <w:b w:val="0"/>
+                <w:sz w:val="22"/>
+              </w:rPr>
+              <w:t>Source not in trusted list — shown but flagged</w:t>
+            </w:r>
+          </w:p>
+        </w:tc>
+      </w:tr>
+      <w:tr>
+        <w:tc>
+          <w:tcPr>
+            <w:tcW w:type="dxa" w:w="2928"/>
+          </w:tcPr>
+          <w:p>
+            <w:r/>
+            <w:r>
+              <w:rPr>
+                <w:b w:val="0"/>
+                <w:sz w:val="22"/>
+              </w:rPr>
+              <w:t>Flagged</w:t>
+            </w:r>
+          </w:p>
+        </w:tc>
+        <w:tc>
+          <w:tcPr>
+            <w:tcW w:type="dxa" w:w="2928"/>
+          </w:tcPr>
+          <w:p>
+            <w:r/>
+            <w:r>
+              <w:rPr>
+                <w:b w:val="0"/>
+                <w:sz w:val="22"/>
+              </w:rPr>
+              <w:t>⚠️ Possible Clickbait</w:t>
+            </w:r>
+          </w:p>
+        </w:tc>
+        <w:tc>
+          <w:tcPr>
+            <w:tcW w:type="dxa" w:w="2928"/>
+          </w:tcPr>
+          <w:p>
+            <w:r/>
+            <w:r>
+              <w:rPr>
+                <w:b w:val="0"/>
+                <w:sz w:val="22"/>
+              </w:rPr>
+              <w:t>Sensational title patterns detected (e.g. "You won't believe…", "!!!")</w:t>
+            </w:r>
+          </w:p>
+        </w:tc>
+      </w:tr>
+      <w:tr>
+        <w:tc>
+          <w:tcPr>
+            <w:tcW w:type="dxa" w:w="2928"/>
+          </w:tcPr>
+          <w:p>
+            <w:r/>
+            <w:r>
+              <w:rPr>
+                <w:b w:val="0"/>
+                <w:sz w:val="22"/>
+              </w:rPr>
+              <w:t>Removed</w:t>
+            </w:r>
+          </w:p>
+        </w:tc>
+        <w:tc>
+          <w:tcPr>
+            <w:tcW w:type="dxa" w:w="2928"/>
+          </w:tcPr>
+          <w:p>
+            <w:r/>
+            <w:r>
+              <w:rPr>
+                <w:b w:val="0"/>
+                <w:sz w:val="22"/>
+              </w:rPr>
+              <w:t>*(filtered out)*</w:t>
+            </w:r>
+          </w:p>
+        </w:tc>
+        <w:tc>
+          <w:tcPr>
+            <w:tcW w:type="dxa" w:w="2928"/>
+          </w:tcPr>
+          <w:p>
+            <w:r/>
+            <w:r>
+              <w:rPr>
+                <w:b w:val="0"/>
+                <w:sz w:val="22"/>
+              </w:rPr>
+              <w:t>Known misinformation sources (e.g. InfoWars) — dropped entirely</w:t>
+            </w:r>
+          </w:p>
+        </w:tc>
+      </w:tr>
+    </w:tbl>
+    <w:p/>
+    <w:p/>
+    <w:p>
+      <w:pPr>
+        <w:spacing w:after="40"/>
+      </w:pPr>
+      <w:r>
+        <w:rPr>
+          <w:b/>
+          <w:sz w:val="22"/>
+        </w:rPr>
+        <w:t>How it works:</w:t>
+      </w:r>
+    </w:p>
+    <w:p>
+      <w:pPr>
+        <w:spacing w:after="40"/>
+      </w:pPr>
+      <w:r>
+        <w:rPr>
+          <w:b w:val="0"/>
+          <w:sz w:val="22"/>
+        </w:rPr>
+        <w:t>1. Each article's source is matched against a curated trusted-sources list (50+ major outlets)</w:t>
+      </w:r>
+    </w:p>
+    <w:p>
+      <w:pPr>
+        <w:spacing w:after="40"/>
+      </w:pPr>
+      <w:r>
+        <w:rPr>
+          <w:b w:val="0"/>
+          <w:sz w:val="22"/>
+        </w:rPr>
+        <w:t>2. Article titles are checked against clickbait regex patterns (sensational language, excessive punctuation, listicle bait)</w:t>
+      </w:r>
+    </w:p>
+    <w:p>
+      <w:pPr>
+        <w:spacing w:after="40"/>
+      </w:pPr>
+      <w:r>
+        <w:rPr>
+          <w:b w:val="0"/>
+          <w:sz w:val="22"/>
+        </w:rPr>
+        <w:t>3. Known unreliable domains are removed before results reach the user</w:t>
+      </w:r>
+    </w:p>
+    <w:p>
+      <w:pPr>
+        <w:spacing w:after="40"/>
+      </w:pPr>
+      <w:r>
+        <w:rPr>
+          <w:b w:val="0"/>
+          <w:sz w:val="22"/>
+        </w:rPr>
+        <w:t>4. All remaining articles display a reliability badge alongside the source name</w:t>
+      </w:r>
+    </w:p>
+    <w:p/>
+    <w:p>
+      <w:pPr>
+        <w:spacing w:before="120"/>
+      </w:pPr>
+      <w:r>
+        <w:rPr>
+          <w:color w:val="CCCCCC"/>
+        </w:rPr>
+        <w:t>─────────────────────────────────────────────────────────────────</w:t>
+      </w:r>
+    </w:p>
+    <w:p/>
+    <w:p>
+      <w:pPr>
+        <w:spacing w:before="200" w:after="80"/>
+      </w:pPr>
+      <w:r>
+        <w:rPr>
+          <w:b/>
+          <w:color w:val="A23B72"/>
+          <w:sz w:val="30"/>
+        </w:rPr>
         <w:t>Fallback Mechanisms</w:t>
       </w:r>
     </w:p>
@@ -2535,6 +2905,38 @@
                 <w:sz w:val="22"/>
               </w:rPr>
               <w:t>Geocoding picks best match by state/country hint</w:t>
+            </w:r>
+          </w:p>
+        </w:tc>
+      </w:tr>
+      <w:tr>
+        <w:tc>
+          <w:tcPr>
+            <w:tcW w:type="dxa" w:w="4392"/>
+          </w:tcPr>
+          <w:p>
+            <w:r/>
+            <w:r>
+              <w:rPr>
+                <w:b w:val="0"/>
+                <w:sz w:val="22"/>
+              </w:rPr>
+              <w:t>All results flagged as unreliable</w:t>
+            </w:r>
+          </w:p>
+        </w:tc>
+        <w:tc>
+          <w:tcPr>
+            <w:tcW w:type="dxa" w:w="4392"/>
+          </w:tcPr>
+          <w:p>
+            <w:r/>
+            <w:r>
+              <w:rPr>
+                <w:b w:val="0"/>
+                <w:sz w:val="22"/>
+              </w:rPr>
+              <w:t>Returns informative message, prompts retry</w:t>
             </w:r>
           </w:p>
         </w:tc>
@@ -3525,6 +3927,38 @@
                 <w:b w:val="0"/>
                 <w:sz w:val="22"/>
               </w:rPr>
+              <w:t>Filter unreliable/misleading content</w:t>
+            </w:r>
+          </w:p>
+        </w:tc>
+        <w:tc>
+          <w:tcPr>
+            <w:tcW w:type="dxa" w:w="4392"/>
+          </w:tcPr>
+          <w:p>
+            <w:r/>
+            <w:r>
+              <w:rPr>
+                <w:b w:val="0"/>
+                <w:sz w:val="22"/>
+              </w:rPr>
+              <w:t>Reliability filter — trusted-source list + clickbait detection + flagged-domain removal</w:t>
+            </w:r>
+          </w:p>
+        </w:tc>
+      </w:tr>
+      <w:tr>
+        <w:tc>
+          <w:tcPr>
+            <w:tcW w:type="dxa" w:w="4392"/>
+          </w:tcPr>
+          <w:p>
+            <w:r/>
+            <w:r>
+              <w:rPr>
+                <w:b w:val="0"/>
+                <w:sz w:val="22"/>
+              </w:rPr>
               <w:t>Automated test cases</w:t>
             </w:r>
           </w:p>

</xml_diff>

<commit_message>
Add personalised news feed — addresses CEP requirement
- session_state tracks category click counts for preference learning
- My Feed tab auto-loads top 3 most-read categories with fresh headlines
- Sidebar multiselect lets users pin favourite categories (always shown first)
- Browse Categories tab retains active-button highlight + reliability filter
- README updated with Personalised News Feed section; README.docx regenerated

Co-Authored-By: Claude Sonnet 4.6 <noreply@anthropic.com>
</commit_message>
<xml_diff>
--- a/README.docx
+++ b/README.docx
@@ -311,6 +311,60 @@
         <w:t xml:space="preserve"> — remembers context across the full conversation via `MemorySaver`</w:t>
       </w:r>
     </w:p>
+    <w:p>
+      <w:pPr>
+        <w:pStyle w:val="ListBullet"/>
+        <w:spacing w:after="40"/>
+      </w:pPr>
+      <w:r>
+        <w:rPr>
+          <w:b w:val="0"/>
+          <w:sz w:val="22"/>
+        </w:rPr>
+        <w:t xml:space="preserve">🛡️ </w:t>
+      </w:r>
+      <w:r>
+        <w:rPr>
+          <w:b/>
+          <w:sz w:val="22"/>
+        </w:rPr>
+        <w:t>Content reliability filter</w:t>
+      </w:r>
+      <w:r>
+        <w:rPr>
+          <w:b w:val="0"/>
+          <w:sz w:val="22"/>
+        </w:rPr>
+        <w:t xml:space="preserve"> — scores and filters unreliable or misleading articles before display</w:t>
+      </w:r>
+    </w:p>
+    <w:p>
+      <w:pPr>
+        <w:pStyle w:val="ListBullet"/>
+        <w:spacing w:after="40"/>
+      </w:pPr>
+      <w:r>
+        <w:rPr>
+          <w:b w:val="0"/>
+          <w:sz w:val="22"/>
+        </w:rPr>
+        <w:t xml:space="preserve">⭐ </w:t>
+      </w:r>
+      <w:r>
+        <w:rPr>
+          <w:b/>
+          <w:sz w:val="22"/>
+        </w:rPr>
+        <w:t>Personalised news feed</w:t>
+      </w:r>
+      <w:r>
+        <w:rPr>
+          <w:b w:val="0"/>
+          <w:sz w:val="22"/>
+        </w:rPr>
+        <w:t xml:space="preserve"> — learns reading preferences from usage history; supports pinned favourite categories</w:t>
+      </w:r>
+    </w:p>
     <w:p/>
     <w:p>
       <w:pPr>
@@ -545,6 +599,90 @@
           <w:color w:val="264653"/>
           <w:sz w:val="18"/>
         </w:rPr>
+        <w:t xml:space="preserve">    ├── Reliability Filter  ←── applied to every article before display</w:t>
+      </w:r>
+    </w:p>
+    <w:p>
+      <w:pPr>
+        <w:spacing w:after="0"/>
+        <w:ind w:left="576"/>
+      </w:pPr>
+      <w:r>
+        <w:rPr>
+          <w:rFonts w:ascii="Courier New" w:hAnsi="Courier New"/>
+          <w:color w:val="264653"/>
+          <w:sz w:val="18"/>
+        </w:rPr>
+        <w:t xml:space="preserve">    │       ├── Trusted sources  → ✅ green badge</w:t>
+      </w:r>
+    </w:p>
+    <w:p>
+      <w:pPr>
+        <w:spacing w:after="0"/>
+        <w:ind w:left="576"/>
+      </w:pPr>
+      <w:r>
+        <w:rPr>
+          <w:rFonts w:ascii="Courier New" w:hAnsi="Courier New"/>
+          <w:color w:val="264653"/>
+          <w:sz w:val="18"/>
+        </w:rPr>
+        <w:t xml:space="preserve">    │       ├── Unverified       → ❓ grey badge</w:t>
+      </w:r>
+    </w:p>
+    <w:p>
+      <w:pPr>
+        <w:spacing w:after="0"/>
+        <w:ind w:left="576"/>
+      </w:pPr>
+      <w:r>
+        <w:rPr>
+          <w:rFonts w:ascii="Courier New" w:hAnsi="Courier New"/>
+          <w:color w:val="264653"/>
+          <w:sz w:val="18"/>
+        </w:rPr>
+        <w:t xml:space="preserve">    │       ├── Clickbait titles → ⚠️ filtered out</w:t>
+      </w:r>
+    </w:p>
+    <w:p>
+      <w:pPr>
+        <w:spacing w:after="0"/>
+        <w:ind w:left="576"/>
+      </w:pPr>
+      <w:r>
+        <w:rPr>
+          <w:rFonts w:ascii="Courier New" w:hAnsi="Courier New"/>
+          <w:color w:val="264653"/>
+          <w:sz w:val="18"/>
+        </w:rPr>
+        <w:t xml:space="preserve">    │       └── Flagged domains  → 🚫 removed entirely</w:t>
+      </w:r>
+    </w:p>
+    <w:p>
+      <w:pPr>
+        <w:spacing w:after="0"/>
+        <w:ind w:left="576"/>
+      </w:pPr>
+      <w:r>
+        <w:rPr>
+          <w:rFonts w:ascii="Courier New" w:hAnsi="Courier New"/>
+          <w:color w:val="264653"/>
+          <w:sz w:val="18"/>
+        </w:rPr>
+        <w:t xml:space="preserve">    │</w:t>
+      </w:r>
+    </w:p>
+    <w:p>
+      <w:pPr>
+        <w:spacing w:after="0"/>
+        <w:ind w:left="576"/>
+      </w:pPr>
+      <w:r>
+        <w:rPr>
+          <w:rFonts w:ascii="Courier New" w:hAnsi="Courier New"/>
+          <w:color w:val="264653"/>
+          <w:sz w:val="18"/>
+        </w:rPr>
         <w:t xml:space="preserve">    ├── Tool Results  ──► LLM Synthesises Final Answer</w:t>
       </w:r>
     </w:p>
@@ -668,7 +806,7 @@
           <w:color w:val="264653"/>
           <w:sz w:val="18"/>
         </w:rPr>
-        <w:t>├── tools.py                          # @tool-decorated agent tools (5 tools)</w:t>
+        <w:t>├── tools.py                          # @tool-decorated agent tools + reliability filter</w:t>
       </w:r>
     </w:p>
     <w:p>
@@ -1210,7 +1348,7 @@
                 <w:b w:val="0"/>
                 <w:sz w:val="22"/>
               </w:rPr>
-              <w:t>Define 5 `@tool`-decorated agent tools</w:t>
+              <w:t>Define 5 `@tool`-decorated agent tools with reliability filter</w:t>
             </w:r>
           </w:p>
         </w:tc>
@@ -1509,7 +1647,35 @@
                 <w:b w:val="0"/>
                 <w:sz w:val="22"/>
               </w:rPr>
-              <w:t>One-click category buttons with active highlight + instant news fetch</w:t>
+              <w:t xml:space="preserve">Two tabs: </w:t>
+            </w:r>
+            <w:r>
+              <w:rPr>
+                <w:b/>
+                <w:sz w:val="22"/>
+              </w:rPr>
+              <w:t>⭐ My Feed</w:t>
+            </w:r>
+            <w:r>
+              <w:rPr>
+                <w:b w:val="0"/>
+                <w:sz w:val="22"/>
+              </w:rPr>
+              <w:t xml:space="preserve"> (personalised) + </w:t>
+            </w:r>
+            <w:r>
+              <w:rPr>
+                <w:b/>
+                <w:sz w:val="22"/>
+              </w:rPr>
+              <w:t>📂 Browse Categories</w:t>
+            </w:r>
+            <w:r>
+              <w:rPr>
+                <w:b w:val="0"/>
+                <w:sz w:val="22"/>
+              </w:rPr>
+              <w:t xml:space="preserve"> (with active highlight + reliability filter)</w:t>
             </w:r>
           </w:p>
         </w:tc>
@@ -2351,6 +2517,364 @@
           <w:color w:val="A23B72"/>
           <w:sz w:val="30"/>
         </w:rPr>
+        <w:t>Personalised News Feed</w:t>
+      </w:r>
+    </w:p>
+    <w:p/>
+    <w:p>
+      <w:pPr>
+        <w:spacing w:after="40"/>
+      </w:pPr>
+      <w:r>
+        <w:rPr>
+          <w:b w:val="0"/>
+          <w:sz w:val="22"/>
+        </w:rPr>
+        <w:t>NewsGenie addresses the CEP requirement *"Access personalised news feeds alongside general information quickly"* through a preference-learning system built into the Quick Headlines page.</w:t>
+      </w:r>
+    </w:p>
+    <w:p/>
+    <w:p>
+      <w:pPr>
+        <w:spacing w:after="40"/>
+      </w:pPr>
+      <w:r>
+        <w:rPr>
+          <w:b/>
+          <w:sz w:val="22"/>
+        </w:rPr>
+        <w:t>How personalisation works:</w:t>
+      </w:r>
+    </w:p>
+    <w:p/>
+    <w:p>
+      <w:pPr>
+        <w:spacing w:after="40"/>
+      </w:pPr>
+      <w:r>
+        <w:rPr>
+          <w:b w:val="0"/>
+          <w:sz w:val="22"/>
+        </w:rPr>
+        <w:t xml:space="preserve">1. </w:t>
+      </w:r>
+      <w:r>
+        <w:rPr>
+          <w:b/>
+          <w:sz w:val="22"/>
+        </w:rPr>
+        <w:t>Usage tracking</w:t>
+      </w:r>
+      <w:r>
+        <w:rPr>
+          <w:b w:val="0"/>
+          <w:sz w:val="22"/>
+        </w:rPr>
+        <w:t xml:space="preserve"> — every category the user clicks in Browse is recorded in session state with a click count</w:t>
+      </w:r>
+    </w:p>
+    <w:p>
+      <w:pPr>
+        <w:spacing w:after="40"/>
+      </w:pPr>
+      <w:r>
+        <w:rPr>
+          <w:b w:val="0"/>
+          <w:sz w:val="22"/>
+        </w:rPr>
+        <w:t xml:space="preserve">2. </w:t>
+      </w:r>
+      <w:r>
+        <w:rPr>
+          <w:b/>
+          <w:sz w:val="22"/>
+        </w:rPr>
+        <w:t>Ranked feed</w:t>
+      </w:r>
+      <w:r>
+        <w:rPr>
+          <w:b w:val="0"/>
+          <w:sz w:val="22"/>
+        </w:rPr>
+        <w:t xml:space="preserve"> — the </w:t>
+      </w:r>
+      <w:r>
+        <w:rPr>
+          <w:b/>
+          <w:sz w:val="22"/>
+        </w:rPr>
+        <w:t>⭐ My Feed</w:t>
+      </w:r>
+      <w:r>
+        <w:rPr>
+          <w:b w:val="0"/>
+          <w:sz w:val="22"/>
+        </w:rPr>
+        <w:t xml:space="preserve"> tab automatically shows the top 3 most-read categories, fetching fresh headlines for each</w:t>
+      </w:r>
+    </w:p>
+    <w:p>
+      <w:pPr>
+        <w:spacing w:after="40"/>
+      </w:pPr>
+      <w:r>
+        <w:rPr>
+          <w:b w:val="0"/>
+          <w:sz w:val="22"/>
+        </w:rPr>
+        <w:t xml:space="preserve">3. </w:t>
+      </w:r>
+      <w:r>
+        <w:rPr>
+          <w:b/>
+          <w:sz w:val="22"/>
+        </w:rPr>
+        <w:t>Pinned favourites</w:t>
+      </w:r>
+      <w:r>
+        <w:rPr>
+          <w:b w:val="0"/>
+          <w:sz w:val="22"/>
+        </w:rPr>
+        <w:t xml:space="preserve"> — the sidebar lets users explicitly pin preferred categories; pinned ones always appear first in My Feed</w:t>
+      </w:r>
+    </w:p>
+    <w:p>
+      <w:pPr>
+        <w:spacing w:after="40"/>
+      </w:pPr>
+      <w:r>
+        <w:rPr>
+          <w:b w:val="0"/>
+          <w:sz w:val="22"/>
+        </w:rPr>
+        <w:t xml:space="preserve">4. </w:t>
+      </w:r>
+      <w:r>
+        <w:rPr>
+          <w:b/>
+          <w:sz w:val="22"/>
+        </w:rPr>
+        <w:t>Progressive</w:t>
+      </w:r>
+      <w:r>
+        <w:rPr>
+          <w:b w:val="0"/>
+          <w:sz w:val="22"/>
+        </w:rPr>
+        <w:t xml:space="preserve"> — the feed starts empty and grows as the user explores, showing "Build your feed by browsing categories below" until preferences exist</w:t>
+      </w:r>
+    </w:p>
+    <w:p/>
+    <w:tbl>
+      <w:tblPr>
+        <w:tblStyle w:val="TableGrid"/>
+        <w:tblW w:type="auto" w:w="0"/>
+        <w:tblLook w:firstColumn="1" w:firstRow="1" w:lastColumn="0" w:lastRow="0" w:noHBand="0" w:noVBand="1" w:val="04A0"/>
+      </w:tblPr>
+      <w:tblGrid>
+        <w:gridCol w:w="4392"/>
+        <w:gridCol w:w="4392"/>
+      </w:tblGrid>
+      <w:tr>
+        <w:tc>
+          <w:tcPr>
+            <w:tcW w:type="dxa" w:w="4392"/>
+            <w:shd w:val="clear" w:color="auto" w:fill="2E86AB"/>
+          </w:tcPr>
+          <w:p>
+            <w:r>
+              <w:rPr>
+                <w:b/>
+                <w:color w:val="FFFFFF"/>
+              </w:rPr>
+            </w:r>
+            <w:r>
+              <w:rPr>
+                <w:b/>
+                <w:color w:val="FFFFFF"/>
+                <w:sz w:val="22"/>
+              </w:rPr>
+              <w:t>My Feed state</w:t>
+            </w:r>
+          </w:p>
+        </w:tc>
+        <w:tc>
+          <w:tcPr>
+            <w:tcW w:type="dxa" w:w="4392"/>
+            <w:shd w:val="clear" w:color="auto" w:fill="2E86AB"/>
+          </w:tcPr>
+          <w:p>
+            <w:r>
+              <w:rPr>
+                <w:b/>
+                <w:color w:val="FFFFFF"/>
+              </w:rPr>
+            </w:r>
+            <w:r>
+              <w:rPr>
+                <w:b/>
+                <w:color w:val="FFFFFF"/>
+                <w:sz w:val="22"/>
+              </w:rPr>
+              <w:t>What is shown</w:t>
+            </w:r>
+          </w:p>
+        </w:tc>
+      </w:tr>
+      <w:tr>
+        <w:tc>
+          <w:tcPr>
+            <w:tcW w:type="dxa" w:w="4392"/>
+          </w:tcPr>
+          <w:p>
+            <w:r/>
+            <w:r>
+              <w:rPr>
+                <w:b w:val="0"/>
+                <w:sz w:val="22"/>
+              </w:rPr>
+              <w:t>No history, no pins</w:t>
+            </w:r>
+          </w:p>
+        </w:tc>
+        <w:tc>
+          <w:tcPr>
+            <w:tcW w:type="dxa" w:w="4392"/>
+          </w:tcPr>
+          <w:p>
+            <w:r/>
+            <w:r>
+              <w:rPr>
+                <w:b w:val="0"/>
+                <w:sz w:val="22"/>
+              </w:rPr>
+              <w:t>Prompt to browse categories or pin favourites</w:t>
+            </w:r>
+          </w:p>
+        </w:tc>
+      </w:tr>
+      <w:tr>
+        <w:tc>
+          <w:tcPr>
+            <w:tcW w:type="dxa" w:w="4392"/>
+          </w:tcPr>
+          <w:p>
+            <w:r/>
+            <w:r>
+              <w:rPr>
+                <w:b w:val="0"/>
+                <w:sz w:val="22"/>
+              </w:rPr>
+              <w:t>Pins set in sidebar</w:t>
+            </w:r>
+          </w:p>
+        </w:tc>
+        <w:tc>
+          <w:tcPr>
+            <w:tcW w:type="dxa" w:w="4392"/>
+          </w:tcPr>
+          <w:p>
+            <w:r/>
+            <w:r>
+              <w:rPr>
+                <w:b w:val="0"/>
+                <w:sz w:val="22"/>
+              </w:rPr>
+              <w:t>Pinned categories' headlines shown immediately</w:t>
+            </w:r>
+          </w:p>
+        </w:tc>
+      </w:tr>
+      <w:tr>
+        <w:tc>
+          <w:tcPr>
+            <w:tcW w:type="dxa" w:w="4392"/>
+          </w:tcPr>
+          <w:p>
+            <w:r/>
+            <w:r>
+              <w:rPr>
+                <w:b w:val="0"/>
+                <w:sz w:val="22"/>
+              </w:rPr>
+              <w:t>Usage history exists</w:t>
+            </w:r>
+          </w:p>
+        </w:tc>
+        <w:tc>
+          <w:tcPr>
+            <w:tcW w:type="dxa" w:w="4392"/>
+          </w:tcPr>
+          <w:p>
+            <w:r/>
+            <w:r>
+              <w:rPr>
+                <w:b w:val="0"/>
+                <w:sz w:val="22"/>
+              </w:rPr>
+              <w:t>Top 3 most-read categories auto-loaded</w:t>
+            </w:r>
+          </w:p>
+        </w:tc>
+      </w:tr>
+      <w:tr>
+        <w:tc>
+          <w:tcPr>
+            <w:tcW w:type="dxa" w:w="4392"/>
+          </w:tcPr>
+          <w:p>
+            <w:r/>
+            <w:r>
+              <w:rPr>
+                <w:b w:val="0"/>
+                <w:sz w:val="22"/>
+              </w:rPr>
+              <w:t>Pins + history</w:t>
+            </w:r>
+          </w:p>
+        </w:tc>
+        <w:tc>
+          <w:tcPr>
+            <w:tcW w:type="dxa" w:w="4392"/>
+          </w:tcPr>
+          <w:p>
+            <w:r/>
+            <w:r>
+              <w:rPr>
+                <w:b w:val="0"/>
+                <w:sz w:val="22"/>
+              </w:rPr>
+              <w:t>Pins first, then most-read categories to fill remaining slots</w:t>
+            </w:r>
+          </w:p>
+        </w:tc>
+      </w:tr>
+    </w:tbl>
+    <w:p/>
+    <w:p/>
+    <w:p>
+      <w:pPr>
+        <w:spacing w:before="120"/>
+      </w:pPr>
+      <w:r>
+        <w:rPr>
+          <w:color w:val="CCCCCC"/>
+        </w:rPr>
+        <w:t>─────────────────────────────────────────────────────────────────</w:t>
+      </w:r>
+    </w:p>
+    <w:p/>
+    <w:p>
+      <w:pPr>
+        <w:spacing w:before="200" w:after="80"/>
+      </w:pPr>
+      <w:r>
+        <w:rPr>
+          <w:b/>
+          <w:color w:val="A23B72"/>
+          <w:sz w:val="30"/>
+        </w:rPr>
         <w:t>Content Reliability Filter</w:t>
       </w:r>
     </w:p>
@@ -2398,28 +2922,6 @@
                 <w:color w:val="FFFFFF"/>
                 <w:sz w:val="22"/>
               </w:rPr>
-              <w:t>Score</w:t>
-            </w:r>
-          </w:p>
-        </w:tc>
-        <w:tc>
-          <w:tcPr>
-            <w:tcW w:type="dxa" w:w="2928"/>
-            <w:shd w:val="clear" w:color="auto" w:fill="2E86AB"/>
-          </w:tcPr>
-          <w:p>
-            <w:r>
-              <w:rPr>
-                <w:b/>
-                <w:color w:val="FFFFFF"/>
-              </w:rPr>
-            </w:r>
-            <w:r>
-              <w:rPr>
-                <w:b/>
-                <w:color w:val="FFFFFF"/>
-                <w:sz w:val="22"/>
-              </w:rPr>
               <w:t>Badge</w:t>
             </w:r>
           </w:p>
@@ -2442,27 +2944,34 @@
                 <w:color w:val="FFFFFF"/>
                 <w:sz w:val="22"/>
               </w:rPr>
-              <w:t>Criteria</w:t>
+              <w:t>Meaning</w:t>
+            </w:r>
+          </w:p>
+        </w:tc>
+        <w:tc>
+          <w:tcPr>
+            <w:tcW w:type="dxa" w:w="2928"/>
+            <w:shd w:val="clear" w:color="auto" w:fill="2E86AB"/>
+          </w:tcPr>
+          <w:p>
+            <w:r>
+              <w:rPr>
+                <w:b/>
+                <w:color w:val="FFFFFF"/>
+              </w:rPr>
+            </w:r>
+            <w:r>
+              <w:rPr>
+                <w:b/>
+                <w:color w:val="FFFFFF"/>
+                <w:sz w:val="22"/>
+              </w:rPr>
+              <w:t>Action</w:t>
             </w:r>
           </w:p>
         </w:tc>
       </w:tr>
       <w:tr>
-        <w:tc>
-          <w:tcPr>
-            <w:tcW w:type="dxa" w:w="2928"/>
-          </w:tcPr>
-          <w:p>
-            <w:r/>
-            <w:r>
-              <w:rPr>
-                <w:b w:val="0"/>
-                <w:sz w:val="22"/>
-              </w:rPr>
-              <w:t>Trusted</w:t>
-            </w:r>
-          </w:p>
-        </w:tc>
         <w:tc>
           <w:tcPr>
             <w:tcW w:type="dxa" w:w="2928"/>
@@ -2489,12 +2998,10 @@
                 <w:b w:val="0"/>
                 <w:sz w:val="22"/>
               </w:rPr>
-              <w:t>Article from a known reputable outlet (Reuters, BBC, Bloomberg, ESPN, etc.)</w:t>
+              <w:t>Major established outlet (Reuters, BBC, Bloomberg, ESPN, NYT, etc.)</w:t>
             </w:r>
           </w:p>
         </w:tc>
-      </w:tr>
-      <w:tr>
         <w:tc>
           <w:tcPr>
             <w:tcW w:type="dxa" w:w="2928"/>
@@ -2506,10 +3013,12 @@
                 <w:b w:val="0"/>
                 <w:sz w:val="22"/>
               </w:rPr>
-              <w:t>Unverified</w:t>
+              <w:t>Shown with green badge</w:t>
             </w:r>
           </w:p>
         </w:tc>
+      </w:tr>
+      <w:tr>
         <w:tc>
           <w:tcPr>
             <w:tcW w:type="dxa" w:w="2928"/>
@@ -2536,12 +3045,10 @@
                 <w:b w:val="0"/>
                 <w:sz w:val="22"/>
               </w:rPr>
-              <w:t>Source not in trusted list — shown but flagged</w:t>
+              <w:t>Source not in trusted list</w:t>
             </w:r>
           </w:p>
         </w:tc>
-      </w:tr>
-      <w:tr>
         <w:tc>
           <w:tcPr>
             <w:tcW w:type="dxa" w:w="2928"/>
@@ -2553,10 +3060,12 @@
                 <w:b w:val="0"/>
                 <w:sz w:val="22"/>
               </w:rPr>
-              <w:t>Flagged</w:t>
+              <w:t>Shown with grey badge</w:t>
             </w:r>
           </w:p>
         </w:tc>
+      </w:tr>
+      <w:tr>
         <w:tc>
           <w:tcPr>
             <w:tcW w:type="dxa" w:w="2928"/>
@@ -2583,7 +3092,22 @@
                 <w:b w:val="0"/>
                 <w:sz w:val="22"/>
               </w:rPr>
-              <w:t>Sensational title patterns detected (e.g. "You won't believe…", "!!!")</w:t>
+              <w:t>Sensational title detected ("You won't believe…", "!!!", "10 secrets…")</w:t>
+            </w:r>
+          </w:p>
+        </w:tc>
+        <w:tc>
+          <w:tcPr>
+            <w:tcW w:type="dxa" w:w="2928"/>
+          </w:tcPr>
+          <w:p>
+            <w:r/>
+            <w:r>
+              <w:rPr>
+                <w:b w:val="0"/>
+                <w:sz w:val="22"/>
+              </w:rPr>
+              <w:t>Filtered out</w:t>
             </w:r>
           </w:p>
         </w:tc>
@@ -2600,7 +3124,7 @@
                 <w:b w:val="0"/>
                 <w:sz w:val="22"/>
               </w:rPr>
-              <w:t>Removed</w:t>
+              <w:t>🚫 Flagged Domain</w:t>
             </w:r>
           </w:p>
         </w:tc>
@@ -2615,7 +3139,7 @@
                 <w:b w:val="0"/>
                 <w:sz w:val="22"/>
               </w:rPr>
-              <w:t>*(filtered out)*</w:t>
+              <w:t>Known misinformation site (InfoWars, NaturalNews, etc.)</w:t>
             </w:r>
           </w:p>
         </w:tc>
@@ -2630,7 +3154,7 @@
                 <w:b w:val="0"/>
                 <w:sz w:val="22"/>
               </w:rPr>
-              <w:t>Known misinformation sources (e.g. InfoWars) — dropped entirely</w:t>
+              <w:t>Removed entirely</w:t>
             </w:r>
           </w:p>
         </w:tc>
@@ -2659,7 +3183,7 @@
           <w:b w:val="0"/>
           <w:sz w:val="22"/>
         </w:rPr>
-        <w:t>1. Each article's source is matched against a curated trusted-sources list (50+ major outlets)</w:t>
+        <w:t>1. Each article's source is matched against a curated list of 50+ trusted outlets</w:t>
       </w:r>
     </w:p>
     <w:p>
@@ -2671,7 +3195,7 @@
           <w:b w:val="0"/>
           <w:sz w:val="22"/>
         </w:rPr>
-        <w:t>2. Article titles are checked against clickbait regex patterns (sensational language, excessive punctuation, listicle bait)</w:t>
+        <w:t>2. Article titles are scanned with regex patterns to detect sensational/clickbait language</w:t>
       </w:r>
     </w:p>
     <w:p>
@@ -2683,7 +3207,7 @@
           <w:b w:val="0"/>
           <w:sz w:val="22"/>
         </w:rPr>
-        <w:t>3. Known unreliable domains are removed before results reach the user</w:t>
+        <w:t>3. Known unreliable domains are blocked before results reach the user</w:t>
       </w:r>
     </w:p>
     <w:p>
@@ -2695,7 +3219,60 @@
           <w:b w:val="0"/>
           <w:sz w:val="22"/>
         </w:rPr>
-        <w:t>4. All remaining articles display a reliability badge alongside the source name</w:t>
+        <w:t>4. Remaining articles are annotated with a reliability badge</w:t>
+      </w:r>
+    </w:p>
+    <w:p/>
+    <w:p>
+      <w:pPr>
+        <w:spacing w:after="40"/>
+      </w:pPr>
+      <w:r>
+        <w:rPr>
+          <w:b/>
+          <w:sz w:val="22"/>
+        </w:rPr>
+        <w:t>Where it is visible:</w:t>
+      </w:r>
+    </w:p>
+    <w:p>
+      <w:pPr>
+        <w:pStyle w:val="ListBullet"/>
+        <w:spacing w:after="40"/>
+      </w:pPr>
+      <w:r>
+        <w:rPr>
+          <w:b/>
+          <w:sz w:val="22"/>
+        </w:rPr>
+        <w:t>Quick Headlines page</w:t>
+      </w:r>
+      <w:r>
+        <w:rPr>
+          <w:b w:val="0"/>
+          <w:sz w:val="22"/>
+        </w:rPr>
+        <w:t xml:space="preserve"> — shows a metric bar (Total Fetched / Passed Filter / Filtered Out), colour-coded badges on each article, and a collapsible expander listing removed articles with the reason</w:t>
+      </w:r>
+    </w:p>
+    <w:p>
+      <w:pPr>
+        <w:pStyle w:val="ListBullet"/>
+        <w:spacing w:after="40"/>
+      </w:pPr>
+      <w:r>
+        <w:rPr>
+          <w:b/>
+          <w:sz w:val="22"/>
+        </w:rPr>
+        <w:t>AI Chat</w:t>
+      </w:r>
+      <w:r>
+        <w:rPr>
+          <w:b w:val="0"/>
+          <w:sz w:val="22"/>
+        </w:rPr>
+        <w:t xml:space="preserve"> — filtering runs silently; flagged articles are never included in the agent's response</w:t>
       </w:r>
     </w:p>
     <w:p/>
@@ -2840,7 +3417,7 @@
                 <w:b w:val="0"/>
                 <w:sz w:val="22"/>
               </w:rPr>
-              <w:t>Retries 3 times with backoff</w:t>
+              <w:t>Retries 3 times with exponential backoff</w:t>
             </w:r>
           </w:p>
         </w:tc>
@@ -2889,7 +3466,7 @@
                 <w:b w:val="0"/>
                 <w:sz w:val="22"/>
               </w:rPr>
-              <w:t>Ambiguous city name</w:t>
+              <w:t>Ambiguous city name (e.g. "Aurora")</w:t>
             </w:r>
           </w:p>
         </w:tc>
@@ -2904,7 +3481,7 @@
                 <w:b w:val="0"/>
                 <w:sz w:val="22"/>
               </w:rPr>
-              <w:t>Geocoding picks best match by state/country hint</w:t>
+              <w:t>Geocoding fetches top 10 results, picks best match by state/country hint</w:t>
             </w:r>
           </w:p>
         </w:tc>
@@ -3409,7 +3986,7 @@
                 <w:b w:val="0"/>
                 <w:sz w:val="22"/>
               </w:rPr>
-              <w:t>DuckDuckGo news and web search (no API key)</w:t>
+              <w:t>DuckDuckGo news and web search (no API key needed)</w:t>
             </w:r>
           </w:p>
         </w:tc>
@@ -3686,7 +4263,7 @@
                 <w:b w:val="0"/>
                 <w:sz w:val="22"/>
               </w:rPr>
-              <w:t>NewsAPI.org + DuckDuckGo fallback</w:t>
+              <w:t>NewsAPI.org + DuckDuckGo News fallback</w:t>
             </w:r>
           </w:p>
         </w:tc>
@@ -3782,7 +4359,71 @@
                 <w:b w:val="0"/>
                 <w:sz w:val="22"/>
               </w:rPr>
-              <w:t>`get_weather` tool via Open-Meteo (no key needed)</w:t>
+              <w:t>`get_weather` tool via Open-Meteo (no API key needed)</w:t>
+            </w:r>
+          </w:p>
+        </w:tc>
+      </w:tr>
+      <w:tr>
+        <w:tc>
+          <w:tcPr>
+            <w:tcW w:type="dxa" w:w="4392"/>
+          </w:tcPr>
+          <w:p>
+            <w:r/>
+            <w:r>
+              <w:rPr>
+                <w:b w:val="0"/>
+                <w:sz w:val="22"/>
+              </w:rPr>
+              <w:t>Filter unreliable/misleading content</w:t>
+            </w:r>
+          </w:p>
+        </w:tc>
+        <w:tc>
+          <w:tcPr>
+            <w:tcW w:type="dxa" w:w="4392"/>
+          </w:tcPr>
+          <w:p>
+            <w:r/>
+            <w:r>
+              <w:rPr>
+                <w:b w:val="0"/>
+                <w:sz w:val="22"/>
+              </w:rPr>
+              <w:t>Reliability filter — trusted-source list + clickbait regex + flagged-domain removal; visually shown in Quick Headlines with metric bar and colour-coded badges</w:t>
+            </w:r>
+          </w:p>
+        </w:tc>
+      </w:tr>
+      <w:tr>
+        <w:tc>
+          <w:tcPr>
+            <w:tcW w:type="dxa" w:w="4392"/>
+          </w:tcPr>
+          <w:p>
+            <w:r/>
+            <w:r>
+              <w:rPr>
+                <w:b w:val="0"/>
+                <w:sz w:val="22"/>
+              </w:rPr>
+              <w:t>Access personalised news feeds</w:t>
+            </w:r>
+          </w:p>
+        </w:tc>
+        <w:tc>
+          <w:tcPr>
+            <w:tcW w:type="dxa" w:w="4392"/>
+          </w:tcPr>
+          <w:p>
+            <w:r/>
+            <w:r>
+              <w:rPr>
+                <w:b w:val="0"/>
+                <w:sz w:val="22"/>
+              </w:rPr>
+              <w:t>⭐ My Feed tab — usage-tracked preferences + sidebar pinning; top categories auto-loaded</w:t>
             </w:r>
           </w:p>
         </w:tc>
@@ -3814,7 +4455,7 @@
                 <w:b w:val="0"/>
                 <w:sz w:val="22"/>
               </w:rPr>
-              <w:t>`MemorySaver` checkpointer across all turns</w:t>
+              <w:t>`MemorySaver` checkpointer — context preserved across all turns</w:t>
             </w:r>
           </w:p>
         </w:tc>
@@ -3878,7 +4519,7 @@
                 <w:b w:val="0"/>
                 <w:sz w:val="22"/>
               </w:rPr>
-              <w:t>DuckDuckGo fallback + rate-limit retry + direct LLM fallback</w:t>
+              <w:t>DuckDuckGo fallback + 3x retry with backoff + direct LLM fallback</w:t>
             </w:r>
           </w:p>
         </w:tc>
@@ -3911,38 +4552,6 @@
                 <w:sz w:val="22"/>
               </w:rPr>
               <w:t>3-page app with persistent session state</w:t>
-            </w:r>
-          </w:p>
-        </w:tc>
-      </w:tr>
-      <w:tr>
-        <w:tc>
-          <w:tcPr>
-            <w:tcW w:type="dxa" w:w="4392"/>
-          </w:tcPr>
-          <w:p>
-            <w:r/>
-            <w:r>
-              <w:rPr>
-                <w:b w:val="0"/>
-                <w:sz w:val="22"/>
-              </w:rPr>
-              <w:t>Filter unreliable/misleading content</w:t>
-            </w:r>
-          </w:p>
-        </w:tc>
-        <w:tc>
-          <w:tcPr>
-            <w:tcW w:type="dxa" w:w="4392"/>
-          </w:tcPr>
-          <w:p>
-            <w:r/>
-            <w:r>
-              <w:rPr>
-                <w:b w:val="0"/>
-                <w:sz w:val="22"/>
-              </w:rPr>
-              <w:t>Reliability filter — trusted-source list + clickbait detection + flagged-domain removal</w:t>
             </w:r>
           </w:p>
         </w:tc>

</xml_diff>